<commit_message>
Enhance DOCX conversion process and update manuscript files
- Improved the PowerShell script to prioritize 'main_docx.tex' for DOCX exports.
- Added a placeholder image for DOCX output and updated README instructions.
- Created 'main_docx.tex' as a companion file for DOCX exports.
- Revised 'main_sjee.docx' for consistency and clarity in equations and figures.
</commit_message>
<xml_diff>
--- a/sjee/main_sjee.docx
+++ b/sjee/main_sjee.docx
@@ -17,37 +17,21 @@
       <w:r>
         <w:t xml:space="preserve">Marko Mihajlovic</w:t>
       </w:r>
-      <w:r>
-        <w:rPr>
-          <w:rStyle w:val="FootnoteReference"/>
-        </w:rPr>
-        <w:footnoteReference w:id="20"/>
-      </w:r>
     </w:p>
     <w:p>
       <w:pPr>
-        <w:pStyle w:val="AbstractTitle"/>
-      </w:pPr>
-      <w:r>
-        <w:t xml:space="preserve">Abstract</w:t>
+        <w:pStyle w:val="FirstParagraph"/>
+      </w:pPr>
+      <w:r>
+        <w:t xml:space="preserve">Singidunum University, Belgrade, Serbia; ORCID: 0009-0006-7979-0341</w:t>
       </w:r>
     </w:p>
     <w:p>
       <w:pPr>
-        <w:pStyle w:val="Abstract"/>
-      </w:pPr>
-      <w:r>
-        <w:rPr>
-          <w:b/>
-          <w:bCs/>
-        </w:rPr>
-        <w:t xml:space="preserve">Abstract:</w:t>
-      </w:r>
-      <w:r>
-        <w:t xml:space="preserve"> </w:t>
-      </w:r>
-      <w:r>
-        <w:t xml:space="preserve">Placeholder abstract. Replace this paragraph with a concise</w:t>
+        <w:pStyle w:val="BodyText"/>
+      </w:pPr>
+      <w:r>
+        <w:t xml:space="preserve">Abstract: Placeholder abstract. Replace this paragraph with a concise</w:t>
       </w:r>
       <w:r>
         <w:t xml:space="preserve"> </w:t>
@@ -64,23 +48,13 @@
     </w:p>
     <w:p>
       <w:pPr>
-        <w:pStyle w:val="Abstract"/>
-      </w:pPr>
-      <w:r>
-        <w:rPr>
-          <w:b/>
-          <w:bCs/>
-        </w:rPr>
-        <w:t xml:space="preserve">Keywords:</w:t>
-      </w:r>
-      <w:r>
-        <w:t xml:space="preserve"> </w:t>
-      </w:r>
-      <w:r>
-        <w:t xml:space="preserve">Placeholder keyword, Second keyword, Third keyword.</w:t>
+        <w:pStyle w:val="BodyText"/>
+      </w:pPr>
+      <w:r>
+        <w:t xml:space="preserve">Keywords: Placeholder keyword, Second keyword, Third keyword.</w:t>
       </w:r>
     </w:p>
-    <w:bookmarkStart w:id="21" w:name="introduction"/>
+    <w:bookmarkStart w:id="20" w:name="introduction"/>
     <w:p>
       <w:pPr>
         <w:pStyle w:val="Heading1"/>
@@ -124,8 +98,8 @@
         <w:t xml:space="preserve">.</w:t>
       </w:r>
     </w:p>
-    <w:bookmarkEnd w:id="21"/>
-    <w:bookmarkStart w:id="22" w:name="related-work-and-research-gap"/>
+    <w:bookmarkEnd w:id="20"/>
+    <w:bookmarkStart w:id="21" w:name="related-work-and-research-gap"/>
     <w:p>
       <w:pPr>
         <w:pStyle w:val="Heading1"/>
@@ -157,8 +131,8 @@
         <w:t xml:space="preserve">gap after the manuscript content and sources have been prepared.</w:t>
       </w:r>
     </w:p>
-    <w:bookmarkEnd w:id="22"/>
-    <w:bookmarkStart w:id="24" w:name="methodology"/>
+    <w:bookmarkEnd w:id="21"/>
+    <w:bookmarkStart w:id="23" w:name="methodology"/>
     <w:p>
       <w:pPr>
         <w:pStyle w:val="Heading1"/>
@@ -190,7 +164,7 @@
         <w:t xml:space="preserve">quantities used in the analysis.</w:t>
       </w:r>
     </w:p>
-    <w:bookmarkStart w:id="23" w:name="example-equation"/>
+    <w:bookmarkStart w:id="22" w:name="example-equation"/>
     <w:p>
       <w:pPr>
         <w:pStyle w:val="Heading2"/>
@@ -213,21 +187,7 @@
         <w:pStyle w:val="FirstParagraph"/>
       </w:pPr>
       <w:r>
-        <w:t xml:space="preserve">Equation </w:t>
-      </w:r>
-      <w:hyperlink w:anchor="eq:example">
-        <w:r>
-          <w:rPr>
-            <w:rStyle w:val="Hyperlink"/>
-          </w:rPr>
-          <w:t xml:space="preserve">[eq:example]</w:t>
-        </w:r>
-      </w:hyperlink>
-      <w:r>
-        <w:t xml:space="preserve"> </w:t>
-      </w:r>
-      <w:r>
-        <w:t xml:space="preserve">is a typesetting example only:</w:t>
+        <w:t xml:space="preserve">Equation (1) is a typesetting example only:</w:t>
       </w:r>
     </w:p>
     <w:p>
@@ -333,8 +293,8 @@
         <w:t xml:space="preserve">quantities relevant to the completed manuscript.</w:t>
       </w:r>
     </w:p>
+    <w:bookmarkEnd w:id="22"/>
     <w:bookmarkEnd w:id="23"/>
-    <w:bookmarkEnd w:id="24"/>
     <w:bookmarkStart w:id="27" w:name="results"/>
     <w:p>
       <w:pPr>
@@ -358,48 +318,70 @@
         <w:pStyle w:val="FirstParagraph"/>
       </w:pPr>
       <w:r>
-        <w:t xml:space="preserve">Placeholder results. Fig. </w:t>
-      </w:r>
-      <w:hyperlink w:anchor="fig:placeholder">
-        <w:r>
-          <w:rPr>
-            <w:rStyle w:val="Hyperlink"/>
-          </w:rPr>
-          <w:t xml:space="preserve">1</w:t>
-        </w:r>
-      </w:hyperlink>
+        <w:t xml:space="preserve">Placeholder results. Fig. 1 demonstrates a single figure</w:t>
+      </w:r>
       <w:r>
         <w:t xml:space="preserve"> </w:t>
       </w:r>
       <w:r>
-        <w:t xml:space="preserve">demonstrates a single figure</w:t>
-      </w:r>
-      <w:r>
-        <w:t xml:space="preserve"> </w:t>
-      </w:r>
-      <w:r>
         <w:t xml:space="preserve">placed near its first mention.</w:t>
       </w:r>
     </w:p>
-    <w:bookmarkStart w:id="25" w:name="fig:placeholder"/>
-    <w:tbl>
-      <w:tblPr>
-        <w:tblStyle w:val="FigureTable"/>
-        <w:tblW w:type="auto" w:w="0"/>
-        <w:jc w:val="center"/>
-        <w:tblLook w:firstRow="0" w:lastRow="0" w:firstColumn="0" w:lastColumn="0"/>
-      </w:tblPr>
-      <w:tblGrid/>
-    </w:tbl>
     <w:p>
       <w:pPr>
-        <w:pStyle w:val="ImageCaption"/>
-      </w:pPr>
-      <w:r>
-        <w:t xml:space="preserve">Placeholder figure; replace with the final illustration.</w:t>
+        <w:pStyle w:val="BodyText"/>
+      </w:pPr>
+      <w:r>
+        <w:drawing>
+          <wp:inline>
+            <wp:extent cx="3599999" cy="839999"/>
+            <wp:effectExtent b="0" l="0" r="0" t="0"/>
+            <wp:docPr descr="image" title="" id="25" name="Picture"/>
+            <a:graphic>
+              <a:graphicData uri="http://schemas.openxmlformats.org/drawingml/2006/picture">
+                <pic:pic>
+                  <pic:nvPicPr>
+                    <pic:cNvPr descr="figures/placeholder.png" id="26" name="Picture"/>
+                    <pic:cNvPicPr>
+                      <a:picLocks noChangeArrowheads="1" noChangeAspect="1"/>
+                    </pic:cNvPicPr>
+                  </pic:nvPicPr>
+                  <pic:blipFill>
+                    <a:blip r:embed="rId24"/>
+                    <a:stretch>
+                      <a:fillRect/>
+                    </a:stretch>
+                  </pic:blipFill>
+                  <pic:spPr bwMode="auto">
+                    <a:xfrm>
+                      <a:off x="0" y="0"/>
+                      <a:ext cx="3599999" cy="839999"/>
+                    </a:xfrm>
+                    <a:prstGeom prst="rect">
+                      <a:avLst/>
+                    </a:prstGeom>
+                    <a:noFill/>
+                    <a:ln w="9525">
+                      <a:noFill/>
+                      <a:headEnd/>
+                      <a:tailEnd/>
+                    </a:ln>
+                  </pic:spPr>
+                </pic:pic>
+              </a:graphicData>
+            </a:graphic>
+          </wp:inline>
+        </w:drawing>
       </w:r>
     </w:p>
-    <w:bookmarkEnd w:id="25"/>
+    <w:p>
+      <w:pPr>
+        <w:pStyle w:val="BodyText"/>
+      </w:pPr>
+      <w:r>
+        <w:t xml:space="preserve">Fig. 1 − Placeholder figure; replace with the final illustration.</w:t>
+      </w:r>
+    </w:p>
     <w:p>
       <w:pPr>
         <w:pStyle w:val="BodyText"/>
@@ -409,18 +391,8 @@
           <w:b/>
           <w:bCs/>
         </w:rPr>
-        <w:t xml:space="preserve">Table </w:t>
-      </w:r>
-      <w:hyperlink w:anchor="tab:placeholder">
-        <w:r>
-          <w:rPr>
-            <w:rStyle w:val="Hyperlink"/>
-            <w:b/>
-            <w:bCs/>
-          </w:rPr>
-          <w:t xml:space="preserve">1</w:t>
-        </w:r>
-      </w:hyperlink>
+        <w:t xml:space="preserve">Table 1</w:t>
+      </w:r>
       <w:r>
         <w:t xml:space="preserve"> </w:t>
       </w:r>
@@ -434,11 +406,16 @@
         <w:t xml:space="preserve">in square brackets. Its entries are placeholders, not experimental data.</w:t>
       </w:r>
     </w:p>
-    <w:bookmarkStart w:id="26" w:name="tab:placeholder"/>
     <w:p>
       <w:pPr>
-        <w:pStyle w:val="TableCaption"/>
-      </w:pPr>
+        <w:pStyle w:val="BodyText"/>
+      </w:pPr>
+      <w:r>
+        <w:t xml:space="preserve">Table 1</w:t>
+      </w:r>
+      <w:r>
+        <w:br/>
+      </w:r>
       <w:r>
         <w:t xml:space="preserve">Placeholder measurements; replace with verified data.</w:t>
       </w:r>
@@ -448,7 +425,6 @@
         <w:tblStyle w:val="Table"/>
         <w:tblW w:type="auto" w:w="0"/>
         <w:tblLook w:firstRow="1" w:lastRow="0" w:firstColumn="0" w:lastColumn="0" w:noHBand="0" w:noVBand="0" w:val="0020"/>
-        <w:tblCaption w:val="Placeholder measurements; replace with verified data."/>
       </w:tblPr>
       <w:tblGrid>
         <w:gridCol w:w="2640"/>
@@ -573,7 +549,6 @@
         </w:tc>
       </w:tr>
     </w:tbl>
-    <w:bookmarkEnd w:id="26"/>
     <w:bookmarkEnd w:id="27"/>
     <w:bookmarkStart w:id="28" w:name="discussion"/>
     <w:p>
@@ -877,25 +852,6 @@
     <w:p>
       <w:r>
         <w:separator/>
-      </w:r>
-    </w:p>
-  </w:footnote>
-  <w:footnote w:id="20">
-    <w:p>
-      <w:pPr>
-        <w:pStyle w:val="FootnoteText"/>
-      </w:pPr>
-      <w:r>
-        <w:rPr>
-          <w:rStyle w:val="FootnoteReference"/>
-        </w:rPr>
-        <w:footnoteRef/>
-      </w:r>
-      <w:r>
-        <w:t xml:space="preserve"> </w:t>
-      </w:r>
-      <w:r>
-        <w:t xml:space="preserve">Singidunum University, Belgrade, Serbia; ORCID: 0009-0006-7979-0341</w:t>
       </w:r>
     </w:p>
   </w:footnote>

</xml_diff>

<commit_message>
- Added verified references for Schönberger and Fuß (2011) and Lee et al. (2025), with no duplicates. - Integrated both after the telecommunications-security paragraph in Related Work, preserving its narrative structure and accurately distinguishing this study’s scope. - Protected technical capitalization, completed missing page ranges, cleaned URLs, and fixed DOCX accented names and bibliography spacing.
</commit_message>
<xml_diff>
--- a/sjee/main_sjee.docx
+++ b/sjee/main_sjee.docx
@@ -545,6 +545,53 @@
         <w:pStyle w:val="JText"/>
       </w:pPr>
       <w:r>
+        <w:t>Earlier research also examined GPU-assisted encryption in communication protocols. Sch</w:t>
+      </w:r>
+      <w:r>
+        <w:t>ö</w:t>
+      </w:r>
+      <w:r>
+        <w:t>nberger and Fu</w:t>
+      </w:r>
+      <w:r>
+        <w:t>ß</w:t>
+      </w:r>
+      <w:r>
+        <w:t xml:space="preserve"> </w:t>
+      </w:r>
+      <w:r>
+        <w:t>[15]</w:t>
+      </w:r>
+      <w:r>
+        <w:t xml:space="preserve"> investigated GPU precomputation of AES counter-mode keystream for an IPsec-oriented GCM implementation, with subsequent encryption and authentication performed on the CPU. More recently, Lee et al.</w:t>
+      </w:r>
+      <w:r>
+        <w:t xml:space="preserve"> </w:t>
+      </w:r>
+      <w:r>
+        <w:t>[16]</w:t>
+      </w:r>
+      <w:r>
+        <w:t xml:space="preserve"> developed a parallel GPU implementation of GCM, including GHASH processing, and reported throughput exceeding 400</w:t>
+      </w:r>
+      <w:r>
+        <w:t xml:space="preserve"> </w:t>
+      </w:r>
+      <w:r>
+        <w:t>Gbit/s on an RTX</w:t>
+      </w:r>
+      <w:r>
+        <w:t xml:space="preserve"> </w:t>
+      </w:r>
+      <w:r>
+        <w:t>4090. Thus, GPU-assisted telecommunications encryption and authenticated-encryption acceleration are established research directions. The present study instead characterizes reproducible operating conditions for bulk AES-128 processing, distinguishing device-resident execution from synchronous transfer-inclusive processing against hardware-assisted AES-NI. It neither introduces a new AES algorithm nor benchmarks complete AES-GCM or IPsec processing.</w:t>
+      </w:r>
+    </w:p>
+    <w:p>
+      <w:pPr>
+        <w:pStyle w:val="JText"/>
+      </w:pPr>
+      <w:r>
         <w:t>Workload aggregation introduces a further throughput</w:t>
       </w:r>
       <w:r>
@@ -565,7 +612,7 @@
         <w:t xml:space="preserve"> </w:t>
       </w:r>
       <w:r>
-        <w:t>[15]</w:t>
+        <w:t>[17]</w:t>
       </w:r>
       <w:r>
         <w:t xml:space="preserve"> showed that experimental conditions can introduce systematic bias and alter performance results. Kalibera and Jones</w:t>
@@ -574,7 +621,7 @@
         <w:t xml:space="preserve"> </w:t>
       </w:r>
       <w:r>
-        <w:t>[16]</w:t>
+        <w:t>[18]</w:t>
       </w:r>
       <w:r>
         <w:t xml:space="preserve"> emphasized the importance of accounting for variability across multiple levels of experimental replication, while Hoefler and Belli</w:t>
@@ -583,7 +630,7 @@
         <w:t xml:space="preserve"> </w:t>
       </w:r>
       <w:r>
-        <w:t>[17]</w:t>
+        <w:t>[19]</w:t>
       </w:r>
       <w:r>
         <w:t xml:space="preserve"> discussed scientifically defensible performance evaluation of parallel computing systems. These contributions provide a methodological basis for determining whether an acceleration is repeatable under the conditions tested. These studies motivate reporting repeated observations and their execution context rather than relying on the highest throughput measurement. For cryptographic workloads, functional correctness must additionally be verified before timings are accepted as evidence of encryption performance.</w:t>
@@ -974,7 +1021,7 @@
         <w:t xml:space="preserve">The CPU reference uses PyCryptodome with hardware-assisted AES-NI explicitly enabled </w:t>
       </w:r>
       <w:r>
-        <w:t>[9, 18]</w:t>
+        <w:t>[9, 20]</w:t>
       </w:r>
       <w:r>
         <w:t xml:space="preserve">. Native backend initialization was checked for both modes; executed processor instructions were not traced directly. The GPU path uses the validated </w:t>
@@ -1001,7 +1048,7 @@
         <w:t xml:space="preserve"> kernel through CuPy's custom kernel interface </w:t>
       </w:r>
       <w:r>
-        <w:t>[19]</w:t>
+        <w:t>[21]</w:t>
       </w:r>
       <w:r>
         <w:t>. Each CUDA thread processes one 16-byte AES block, with 128 threads per CUDA block. These paths are selected from a broader campaign that evaluated additional implementations. The analysis retains their original execution context, including interleaved jobs excluded from the selected results.</w:t>
@@ -1553,7 +1600,7 @@
         <w:t xml:space="preserve"> interface. Resident execution uses CUDA event timing with the required synchronization, following CUDA and CuPy measurement guidance </w:t>
       </w:r>
       <w:r>
-        <w:t>[12, 20]</w:t>
+        <w:t>[12, 22]</w:t>
       </w:r>
       <w:r>
         <w:t>. Thus, the CPU and pipeline intervals are measured from the host, while the resident interval measures device-side execution.</w:t>
@@ -3114,7 +3161,7 @@
         <w:t xml:space="preserve">The use of repeated sessions, paired workloads, and documented execution conditions follows recommendations on experimental bias and hierarchical variability in performance measurement </w:t>
       </w:r>
       <w:r>
-        <w:t>[15–17]</w:t>
+        <w:t>[17–19]</w:t>
       </w:r>
       <w:r>
         <w:t>. Raw observations and their provenance are retained for verification of the session estimates and acceleration calculations.</w:t>
@@ -6226,7 +6273,7 @@
         <w:t xml:space="preserve"> </w:t>
       </w:r>
       <w:r>
-        <w:t>[21]</w:t>
+        <w:t>[23]</w:t>
       </w:r>
       <w:r>
         <w:t>, while AES-GCM is specified for ESP in RFC</w:t>
@@ -6241,7 +6288,7 @@
         <w:t xml:space="preserve"> </w:t>
       </w:r>
       <w:r>
-        <w:t>[22]</w:t>
+        <w:t>[24]</w:t>
       </w:r>
       <w:r>
         <w:t>. These standards connect the evaluated encryption operation to IPsec-oriented architectures, but the experiments cover neither complete ESP processing nor authenticated encryption. Such processing adds packet framing, security-association state, nonce and sequence-number management, authentication, and delivery. AES-GCM additionally requires GHASH and authentication-tag processing. The measured CTR acceleration cannot determine the throughput of that complete operation.</w:t>
@@ -6477,6 +6524,7 @@
     <w:p>
       <w:pPr>
         <w:pStyle w:val="JReference"/>
+        <w:jc w:val="left"/>
       </w:pPr>
       <w:r>
         <w:t>National Institute of Standards and Technology: Advanced Encryption Standard (AES), National Institute of Standards and Technology, Federal Information Processing Standards Publication 197, Update 1, 2023, doi: 10.6028/NIST.FIPS.197-upd1.</w:t>
@@ -6485,6 +6533,7 @@
     <w:p>
       <w:pPr>
         <w:pStyle w:val="JReference"/>
+        <w:jc w:val="left"/>
       </w:pPr>
       <w:r>
         <w:t>M. Dworkin: Recommendation for Block Cipher Modes of Operation: Methods and Techniques, National Institute of Standards and Technology, NIST Special Publication 800-38A, 2001, doi: 10.6028/NIST.SP.800-38A.</w:t>
@@ -6493,14 +6542,16 @@
     <w:p>
       <w:pPr>
         <w:pStyle w:val="JReference"/>
-      </w:pPr>
-      <w:r>
-        <w:t>S. A. Manavski: CUDA Compatible GPU as an Efficient Hardware Accelerator for AES Cryptography, Proceedings of the IEEE International Conference on Signal Processing and Communications, 2007, doi: 10.1109/ICSPC.2007.4728256.</w:t>
+        <w:jc w:val="left"/>
+      </w:pPr>
+      <w:r>
+        <w:t>S. A. Manavski: CUDA Compatible GPU as an Efficient Hardware Accelerator for AES Cryptography, Proceedings of the IEEE International Conference on Signal Processing and Communications, 2007, pp. 65–68, doi: 10.1109/ICSPC.2007.4728256.</w:t>
       </w:r>
     </w:p>
     <w:p>
       <w:pPr>
         <w:pStyle w:val="JReference"/>
+        <w:jc w:val="left"/>
       </w:pPr>
       <w:r>
         <w:t>O. Harrison, J. Waldron: AES Encryption and Decryption on the GPU, GPU Gems 3, Addison-Wesley Professional, Ch. 36, 2007, https://developer.nvidia.com/gpugems/gpugems3/part-vi-gpu-computing/chapter-36-aes-encryption-and-decryption-gpu.</w:t>
@@ -6509,6 +6560,7 @@
     <w:p>
       <w:pPr>
         <w:pStyle w:val="JReference"/>
+        <w:jc w:val="left"/>
       </w:pPr>
       <w:r>
         <w:t>K. Iwai, N. Nishikawa, T. Kurokawa: Acceleration of AES Encryption on CUDA GPU, International Journal of Networking and Computing, Vol. 2, No. 1, 2012, pp. 131–145, doi: 10.15803/ijnc.2.1_131.</w:t>
@@ -6517,6 +6569,7 @@
     <w:p>
       <w:pPr>
         <w:pStyle w:val="JReference"/>
+        <w:jc w:val="left"/>
       </w:pPr>
       <w:r>
         <w:t>C. Wang, X. Chu: GPU Accelerated AES Algorithm, 2019, https://arxiv.org/abs/1902.05234.</w:t>
@@ -6525,6 +6578,7 @@
     <w:p>
       <w:pPr>
         <w:pStyle w:val="JReference"/>
+        <w:jc w:val="left"/>
       </w:pPr>
       <w:r>
         <w:t>C. Tezcan: Optimization of Advanced Encryption Standard on Graphics Processing Units, IEEE Access, Vol. 9, 2021, pp. 67315–67326, doi: 10.1109/ACCESS.2021.3077551.</w:t>
@@ -6533,6 +6587,7 @@
     <w:p>
       <w:pPr>
         <w:pStyle w:val="JReference"/>
+        <w:jc w:val="left"/>
       </w:pPr>
       <w:r>
         <w:t>W.-K. Lee, S. C. Seo, H. Seo, D. C. Kim, S. O. Hwang: Speed Record of AES-CTR and AES-ECB Bit-Sliced Implementation on GPUs, IEEE Embedded Systems Letters, Vol. 16, No. 4, 2024, pp. 481–484, doi: 10.1109/LES.2024.3409725.</w:t>
@@ -6541,6 +6596,7 @@
     <w:p>
       <w:pPr>
         <w:pStyle w:val="JReference"/>
+        <w:jc w:val="left"/>
       </w:pPr>
       <w:r>
         <w:t>Intel Corporation: Intel Advanced Encryption Standard Instructions (AES-NI), 2012, https://www.intel.com/content/www/us/en/developer/articles/technical/advanced-encryption-standard-instructions-aes-ni.html.</w:t>
@@ -6549,6 +6605,7 @@
     <w:p>
       <w:pPr>
         <w:pStyle w:val="JReference"/>
+        <w:jc w:val="left"/>
       </w:pPr>
       <w:r>
         <w:t>V. W. Lee, C. Kim, J. Chhugani, M. Deisher, D. Kim, A. D. Nguyen, N. Satish, M. Smelyanskiy, S. Chennupaty, P. Hammarlund, R. Singhal, P. Dubey: Debunking the 100X GPU vs. CPU Myth: An Evaluation of Throughput Computing on CPU and GPU, Proceedings of the 37th Annual International Symposium on Computer Architecture, 2010, pp. 451–460, doi: 10.1145/1815961.1816021.</w:t>
@@ -6557,6 +6614,7 @@
     <w:p>
       <w:pPr>
         <w:pStyle w:val="JReference"/>
+        <w:jc w:val="left"/>
       </w:pPr>
       <w:r>
         <w:t>C. Gregg, K. Hazelwood: Where Is the Data? Why You Cannot Debate CPU vs. GPU Performance Without the Answer, 2011 IEEE International Symposium on Performance Analysis of Systems and Software (ISPASS), 2011, pp. 134–144, doi: 10.1109/ISPASS.2011.5762730.</w:t>
@@ -6565,6 +6623,7 @@
     <w:p>
       <w:pPr>
         <w:pStyle w:val="JReference"/>
+        <w:jc w:val="left"/>
       </w:pPr>
       <w:r>
         <w:t>NVIDIA Corporation: CUDA C++ Best Practices Guide, n.d., https://docs.nvidia.com/cuda/cuda-c-best-practices-guide/, Accessed 2026.</w:t>
@@ -6573,6 +6632,7 @@
     <w:p>
       <w:pPr>
         <w:pStyle w:val="JReference"/>
+        <w:jc w:val="left"/>
       </w:pPr>
       <w:r>
         <w:t>M. Harris: How to Overlap Data Transfers in CUDA C/C++, NVIDIA Technical Blog, 2012, https://developer.nvidia.com/blog/how-overlap-data-transfers-cuda-cc/.</w:t>
@@ -6581,6 +6641,7 @@
     <w:p>
       <w:pPr>
         <w:pStyle w:val="JReference"/>
+        <w:jc w:val="left"/>
       </w:pPr>
       <w:r>
         <w:t>M. Dworkin: Recommendation for Block Cipher Modes of Operation: Galois/Counter Mode (GCM) and GMAC, National Institute of Standards and Technology, NIST Special Publication 800-38D, 2007, doi: 10.6028/NIST.SP.800-38D.</w:t>
@@ -6589,6 +6650,25 @@
     <w:p>
       <w:pPr>
         <w:pStyle w:val="JReference"/>
+        <w:jc w:val="left"/>
+      </w:pPr>
+      <w:r>
+        <w:t>Georg Schönberger, Jürgen Fuß: GPU-Assisted AES Encryption Using GCM, Communications and Multimedia Security, Lecture Notes in Computer Science, Springer, Vol. 7025, 2011, pp. 178–185, doi: 10.1007/978-3-642-24712-5_16.</w:t>
+      </w:r>
+    </w:p>
+    <w:p>
+      <w:pPr>
+        <w:pStyle w:val="JReference"/>
+        <w:jc w:val="left"/>
+      </w:pPr>
+      <w:r>
+        <w:t>JaeSeok Lee, DongCheon Kim, Seog Chung Seo: Parallel Implementation of GCM on GPUs, ICT Express, Vol. 11, No. 2, 2025, pp. 310–316, doi: 10.1016/j.icte.2025.01.006.</w:t>
+      </w:r>
+    </w:p>
+    <w:p>
+      <w:pPr>
+        <w:pStyle w:val="JReference"/>
+        <w:jc w:val="left"/>
       </w:pPr>
       <w:r>
         <w:t>T. Mytkowicz, A. Diwan, M. Hauswirth, P. F. Sweeney: Producing Wrong Data Without Doing Anything Obviously Wrong!, Proceedings of the 14th International Conference on Architectural Support for Programming Languages and Operating Systems, 2009, pp. 265–276, doi: 10.1145/1508244.1508275.</w:t>
@@ -6597,14 +6677,16 @@
     <w:p>
       <w:pPr>
         <w:pStyle w:val="JReference"/>
-      </w:pPr>
-      <w:r>
-        <w:t>T. Kalibera, R. E. Jones: Rigorous Benchmarking in Reasonable Time, Proceedings of the International Symposium on Memory Management, 2013, doi: 10.1145/2464157.2464160.</w:t>
+        <w:jc w:val="left"/>
+      </w:pPr>
+      <w:r>
+        <w:t>T. Kalibera, R. E. Jones: Rigorous Benchmarking in Reasonable Time, Proceedings of the International Symposium on Memory Management, 2013, pp. 63–74, doi: 10.1145/2464157.2464160.</w:t>
       </w:r>
     </w:p>
     <w:p>
       <w:pPr>
         <w:pStyle w:val="JReference"/>
+        <w:jc w:val="left"/>
       </w:pPr>
       <w:r>
         <w:t>T. Hoefler, R. Belli: Scientific Benchmarking of Parallel Computing Systems: Twelve Ways to Tell the Masses When Reporting Performance Results, Proceedings of the International Conference for High Performance Computing, Networking, Storage and Analysis, 2015, pp. 73:1–73:12, doi: 10.1145/2807591.2807644.</w:t>
@@ -6613,41 +6695,46 @@
     <w:p>
       <w:pPr>
         <w:pStyle w:val="JReference"/>
-      </w:pPr>
-      <w:r>
-        <w:t>PyCryptodome: PyCryptodome Documentation, n.d., https://pycryptodome.readthedocs.io/, Accessed 2026.</w:t>
+        <w:jc w:val="left"/>
+      </w:pPr>
+      <w:r>
+        <w:t>PyCryptodome: PyCryptodome Documentation, n.d., https://www.pycryptodome.org/, Accessed 2026.</w:t>
       </w:r>
     </w:p>
     <w:p>
       <w:pPr>
         <w:pStyle w:val="JReference"/>
-      </w:pPr>
-      <w:r>
-        <w:t>CuPy: cupy.RawKernel, https://docs.cupy.dev/en/stable/reference/generated/cupy.RawKernel.html, n.d., Accessed 2026.</w:t>
+        <w:jc w:val="left"/>
+      </w:pPr>
+      <w:r>
+        <w:t>CuPy: cupy.RawKernel, n.d., https://docs.cupy.dev/en/stable/reference/generated/cupy.RawKernel.html, Accessed 2026.</w:t>
       </w:r>
     </w:p>
     <w:p>
       <w:pPr>
         <w:pStyle w:val="JReference"/>
-      </w:pPr>
-      <w:r>
-        <w:t>CuPy: Performance Best Practices, https://docs.cupy.dev/en/stable/user_guide/performance.html, n.d., Accessed 2026.</w:t>
+        <w:jc w:val="left"/>
+      </w:pPr>
+      <w:r>
+        <w:t>CuPy: Performance Best Practices, n.d., https://docs.cupy.dev/en/stable/user_guide/performance.html, Accessed 2026.</w:t>
       </w:r>
     </w:p>
     <w:p>
       <w:pPr>
         <w:pStyle w:val="JReference"/>
-      </w:pPr>
-      <w:r>
-        <w:t>Russ Housley: Using Advanced Encryption Standard (AES) Counter Mode With IPsec Encapsulating Security Payload (ESP), Internet Engineering Task Force, RFC 3686, January 2004, doi: 10.17487/RFC3686, https://www.rfc-editor.org/info/rfc3686.</w:t>
+        <w:jc w:val="left"/>
+      </w:pPr>
+      <w:r>
+        <w:t>Russ Housley: Using Advanced Encryption Standard (AES) Counter Mode With IPsec Encapsulating Security Payload (ESP), Internet Engineering Task Force, RFC 3686, January 2004, doi: 10.17487/RFC3686.</w:t>
       </w:r>
     </w:p>
     <w:p>
       <w:pPr>
         <w:pStyle w:val="JReference"/>
-      </w:pPr>
-      <w:r>
-        <w:t>John Viega, David A. McGrew: The Use of Galois/Counter Mode (GCM) in IPsec Encapsulating Security Payload (ESP), Internet Engineering Task Force, RFC 4106, June 2005, doi: 10.17487/RFC4106, https://www.rfc-editor.org/info/rfc4106.</w:t>
+        <w:jc w:val="left"/>
+      </w:pPr>
+      <w:r>
+        <w:t>John Viega, David A. McGrew: The Use of Galois/Counter Mode (GCM) in IPsec Encapsulating Security Payload (ESP), Internet Engineering Task Force, RFC 4106, June 2005, doi: 10.17487/RFC4106.</w:t>
       </w:r>
     </w:p>
     <w:sectPr>

</xml_diff>

<commit_message>
Refactor AES encryption study documentation and update tests
- Updated the title and abstract of the main document to reflect the focus on GPU-resident AES-CTR encryption and its performance implications.
- Revised the introduction and related work sections to clarify the context and significance of the study.
- Enhanced the results and discussion sections with detailed observations on GPU performance relative to CPU implementations, emphasizing the impact of data movement.
- Added a new reference for the Apache Parquet Modular Encryption documentation.
- Adjusted test cases to align with the updated manuscript structure, including changes to the expected number of equations, tables, and references.
</commit_message>
<xml_diff>
--- a/sjee/main_sjee.docx
+++ b/sjee/main_sjee.docx
@@ -7,9 +7,11 @@
         <w:pStyle w:val="JTitle"/>
       </w:pPr>
       <w:r>
-        <w:t>Accelerating Bulk AES Encryption Performance</w:t>
+        <w:t>GPU-Resident AES-CTR Encryption of</w:t>
         <w:br/>
-        <w:t>in Telecommunications with GPU Computing</w:t>
+        <w:t>Independent Data Pages: Computational Gains</w:t>
+        <w:br/>
+        <w:t>and Transfer Limits</w:t>
       </w:r>
     </w:p>
     <w:p>
@@ -37,19 +39,25 @@
         <w:t xml:space="preserve">Abstract: </w:t>
       </w:r>
       <w:r>
-        <w:t>This paper evaluates GPU computing for accelerating bulk AES encryption in telecommunications-oriented processing, where higher throughput must offset the cost of moving data through an accelerator. Validated AES-128 CTR and ECB implementations are compared with hardware-assisted CPU AES-NI across three heterogeneous systems, using paired workloads and five sessions per system. Measurements distinguish device-resident execution from a prepared-buffer pipeline including synchronous host</w:t>
+        <w:t>Accelerating AES-CTR with a GPU is useful only when the gains from parallel computation exceed host</w:t>
       </w:r>
       <w:r>
         <w:t>–</w:t>
       </w:r>
       <w:r>
-        <w:t>device transfers and synchronization. For 32</w:t>
+        <w:t>device data-movement costs. This study investigates that condition using validated AES-128 CUDA implementations, a native OpenSSL EVP AES-NI baseline, and a batch of independent 1</w:t>
       </w:r>
       <w:r>
         <w:t xml:space="preserve"> </w:t>
       </w:r>
       <w:r>
-        <w:t xml:space="preserve">MiB CTR buffers, median paired pipeline speedups reach </w:t>
+        <w:t>MiB data pages motivated by columnar storage encryption. Five repeated Tesla T4 sessions show that, for 32 independently encrypted pages (32</w:t>
+      </w:r>
+      <w:r>
+        <w:t xml:space="preserve"> </w:t>
+      </w:r>
+      <w:r>
+        <w:t xml:space="preserve">MiB), GPU-resident AES-CTR computation achieves a </w:t>
       </w:r>
       <m:oMath>
         <m:box>
@@ -61,7 +69,7 @@
               <w:rPr>
                 <w:sz w:val="22"/>
               </w:rPr>
-              <m:t>1.354</m:t>
+              <m:t>2.251</m:t>
             </m:r>
             <m:r>
               <m:rPr>
@@ -76,7 +84,7 @@
         </m:box>
       </m:oMath>
       <w:r>
-        <w:t xml:space="preserve"> on T600 and </w:t>
+        <w:t xml:space="preserve"> speedup relative to the prepared native CPU transformation, whereas the transfer-inclusive prepared GPU pipeline achieves only </w:t>
       </w:r>
       <m:oMath>
         <m:box>
@@ -88,7 +96,7 @@
               <w:rPr>
                 <w:sz w:val="22"/>
               </w:rPr>
-              <m:t>4.761</m:t>
+              <m:t>0.913</m:t>
             </m:r>
             <m:r>
               <m:rPr>
@@ -103,7 +111,31 @@
         </m:box>
       </m:oMath>
       <w:r>
-        <w:t xml:space="preserve"> on Tesla T4 relative to their respective CPU implementations, with gains in all five sessions. GTX achieves </w:t>
+        <w:t>. The corresponding median times are 3.714</w:t>
+      </w:r>
+      <w:r>
+        <w:t xml:space="preserve"> </w:t>
+      </w:r>
+      <w:r>
+        <w:t>ms for the GPU resident kernel, 8.362</w:t>
+      </w:r>
+      <w:r>
+        <w:t xml:space="preserve"> </w:t>
+      </w:r>
+      <w:r>
+        <w:t>ms for OpenSSL transformation, and 9.153</w:t>
+      </w:r>
+      <w:r>
+        <w:t xml:space="preserve"> </w:t>
+      </w:r>
+      <w:r>
+        <w:t>ms for the GPU pipeline. Page-aware GPU execution has approximately the same pipeline throughput as a continuous 32</w:t>
+      </w:r>
+      <w:r>
+        <w:t xml:space="preserve"> </w:t>
+      </w:r>
+      <w:r>
+        <w:t xml:space="preserve">MiB CTR stream (a </w:t>
       </w:r>
       <m:oMath>
         <m:box>
@@ -115,7 +147,7 @@
               <w:rPr>
                 <w:sz w:val="22"/>
               </w:rPr>
-              <m:t>0.935</m:t>
+              <m:t>1.007</m:t>
             </m:r>
             <m:r>
               <m:rPr>
@@ -130,7 +162,67 @@
         </m:box>
       </m:oMath>
       <w:r>
-        <w:t>, showing that the benefit depends on the configuration. These results demonstrate that GPU-assisted AES-CTR can outperform hardware-accelerated CPU encryption under the tested transfer-inclusive conditions, providing an experimental basis for bulk cryptographic processing in heterogeneous telecommunications architectures.</w:t>
+        <w:t xml:space="preserve"> page-to-continuous ratio), indicating little added cost for independent counter domains in this implementation. In a separate same-runtime comparison, the apparent 32</w:t>
+      </w:r>
+      <w:r>
+        <w:t xml:space="preserve"> </w:t>
+      </w:r>
+      <w:r>
+        <w:t xml:space="preserve">MiB GPU advantage changes from </w:t>
+      </w:r>
+      <m:oMath>
+        <m:box>
+          <m:e>
+            <m:r>
+              <m:rPr>
+                <m:sty m:val="p"/>
+              </m:rPr>
+              <w:rPr>
+                <w:sz w:val="22"/>
+              </w:rPr>
+              <m:t>5.586</m:t>
+            </m:r>
+            <m:r>
+              <m:rPr>
+                <m:sty m:val="p"/>
+              </m:rPr>
+              <w:rPr>
+                <w:sz w:val="22"/>
+              </w:rPr>
+              <m:t>×</m:t>
+            </m:r>
+          </m:e>
+        </m:box>
+      </m:oMath>
+      <w:r>
+        <w:t xml:space="preserve"> against PyCryptodome to </w:t>
+      </w:r>
+      <m:oMath>
+        <m:box>
+          <m:e>
+            <m:r>
+              <m:rPr>
+                <m:sty m:val="p"/>
+              </m:rPr>
+              <w:rPr>
+                <w:sz w:val="22"/>
+              </w:rPr>
+              <m:t>0.942</m:t>
+            </m:r>
+            <m:r>
+              <m:rPr>
+                <m:sty m:val="p"/>
+              </m:rPr>
+              <w:rPr>
+                <w:sz w:val="22"/>
+              </w:rPr>
+              <m:t>×</m:t>
+            </m:r>
+          </m:e>
+        </m:box>
+      </m:oMath>
+      <w:r>
+        <w:t xml:space="preserve"> against native OpenSSL. The practical opportunity is therefore GPU-resident encryption as a stage within an already device-resident workflow, not general-purpose offloading of host-resident data. That application-level opportunity remains a conditional implication rather than a measured end-to-end application speedup.</w:t>
       </w:r>
     </w:p>
     <w:p>
@@ -144,7 +236,7 @@
         <w:t xml:space="preserve">Keywords: </w:t>
       </w:r>
       <w:r>
-        <w:t>Advanced Encryption Standard (AES), AES-NI, GPU acceleration, CUDA, Heterogeneous computing, Cryptographic benchmarking, Data-transfer overhead, Reproducible performance evaluation.</w:t>
+        <w:t>AES-CTR, GPU-resident encryption, Independent data pages, CUDA, AES-NI, OpenSSL, Data movement, Heterogeneous processing.</w:t>
       </w:r>
     </w:p>
     <w:p>
@@ -162,65 +254,145 @@
     <w:p>
       <w:pPr>
         <w:pStyle w:val="JText"/>
-      </w:pPr>
-      <w:r>
-        <w:t>Telecommunications infrastructure must protect increasing volumes of data while maintaining throughput and acceptable processing latency. Communication gateways, network services, and distributed processing systems therefore require efficient cryptographic operations. The Advanced Encryption Standard (AES), specified in NIST FIPS</w:t>
+        <w:spacing w:line="240" w:lineRule="auto"/>
+      </w:pPr>
+      <w:r>
+        <w:t>The Advanced Encryption Standard (AES) is widely used to protect stored and transmitted data</w:t>
       </w:r>
       <w:r>
         <w:t xml:space="preserve"> </w:t>
       </w:r>
       <w:r>
-        <w:t xml:space="preserve">197 </w:t>
-      </w:r>
-      <w:r>
         <w:t>[1]</w:t>
       </w:r>
       <w:r>
-        <w:t>, is a fundamental building block of symmetric encryption. Its practical performance depends on hardware acceleration, execution strategy, and data movement between processing resources, as well as the cryptographic algorithm.</w:t>
+        <w:t xml:space="preserve">. Counter (CTR) mode exposes independent block-encryption operations and is amenable to parallel execution </w:t>
+      </w:r>
+      <w:r>
+        <w:t xml:space="preserve"> </w:t>
+      </w:r>
+      <w:r>
+        <w:t>[2]</w:t>
+      </w:r>
+      <w:r>
+        <w:t>. Nevertheless, a GPU is not automatically the fastest place to perform encryption: host processors provide dedicated AES instructions, and moving plaintext and ciphertext across the CPU</w:t>
+      </w:r>
+      <w:r>
+        <w:t>–</w:t>
+      </w:r>
+      <w:r>
+        <w:t>GPU boundary consumes time. An application using an accelerator must therefore distinguish the cost of AES computation from the cost of placing data where that computation occurs.</w:t>
       </w:r>
     </w:p>
     <w:p>
       <w:pPr>
         <w:pStyle w:val="JText"/>
-      </w:pPr>
-      <w:r>
-        <w:t xml:space="preserve">Hardware-assisted CPU encryption provides the reference against which an alternative processing path must be evaluated. Graphics processing units (GPUs) offer parallel execution that can benefit workloads containing many independent AES operations. Counter (CTR) mode permits independent counter blocks to be encrypted in parallel to generate keystream </w:t>
-      </w:r>
-      <w:r>
-        <w:t>[2]</w:t>
-      </w:r>
-      <w:r>
-        <w:t>, making it suitable for investigating GPU-assisted bulk encryption. Large buffers and collections of independent data units are potential workloads for telecommunications-oriented systems that already contain general-purpose GPUs. Such systems could use existing heterogeneous computing resources for bulk encryption without requiring a dedicated cryptographic accelerator. Whether this is beneficial depends on the costs of moving the workload through the GPU as well as the throughput of the encryption operation itself.</w:t>
+        <w:spacing w:line="240" w:lineRule="auto"/>
+      </w:pPr>
+      <w:r>
+        <w:t xml:space="preserve">This distinction matters for storage and analytics workloads consisting of many independent data units. The Apache Parquet encryption specification provides a concrete motivation: its </w:t>
+      </w:r>
+      <w:r>
+        <w:rPr>
+          <w:rFonts w:ascii="Courier New" w:hAnsi="Courier New"/>
+        </w:rPr>
+        <w:t>AES</w:t>
+      </w:r>
+      <w:r>
+        <w:rPr>
+          <w:rFonts w:ascii="Courier New" w:hAnsi="Courier New"/>
+        </w:rPr>
+        <w:t>_</w:t>
+      </w:r>
+      <w:r>
+        <w:rPr>
+          <w:rFonts w:ascii="Courier New" w:hAnsi="Courier New"/>
+        </w:rPr>
+        <w:t>GCM</w:t>
+      </w:r>
+      <w:r>
+        <w:rPr>
+          <w:rFonts w:ascii="Courier New" w:hAnsi="Courier New"/>
+        </w:rPr>
+        <w:t>_</w:t>
+      </w:r>
+      <w:r>
+        <w:rPr>
+          <w:rFonts w:ascii="Courier New" w:hAnsi="Courier New"/>
+        </w:rPr>
+        <w:t>CTR</w:t>
+      </w:r>
+      <w:r>
+        <w:rPr>
+          <w:rFonts w:ascii="Courier New" w:hAnsi="Courier New"/>
+        </w:rPr>
+        <w:t>_</w:t>
+      </w:r>
+      <w:r>
+        <w:rPr>
+          <w:rFonts w:ascii="Courier New" w:hAnsi="Courier New"/>
+        </w:rPr>
+        <w:t>V1</w:t>
+      </w:r>
+      <w:r>
+        <w:t xml:space="preserve"> mode uses CTR encryption for data pages and GCM protection for other encrypted modules. Rather than claim support for a complete Parquet file, we study a controlled, Parquet-inspired workload of independent 1</w:t>
+      </w:r>
+      <w:r>
+        <w:t xml:space="preserve"> </w:t>
+      </w:r>
+      <w:r>
+        <w:t>MiB pages with a distinct 96-bit nonce and a 32-bit counter initialized to one for each logical page. The study does not implement file framing, authenticated metadata, key management, compression, or Parquet interoperability. CTR encryption alone does not provide authentication.</w:t>
       </w:r>
     </w:p>
     <w:p>
       <w:pPr>
         <w:pStyle w:val="JText"/>
-      </w:pPr>
-      <w:r>
-        <w:t>Using these resources for encryption introduces host-to-device transfers, kernel execution, synchronization, and transfers back to host memory. These costs can reduce or eliminate the computational advantage of parallel execution. The relevant question is therefore whether GPU-assisted AES processing provides a reproducible bulk-throughput improvement over hardware-accelerated CPU execution, and which workload, platform, and data-movement conditions determine that improvement. The study distinguishes performance with data already resident in GPU memory from performance that includes synchronous host</w:t>
-      </w:r>
-      <w:r>
-        <w:t>–</w:t>
-      </w:r>
-      <w:r>
-        <w:t>device transfers and synchronization.</w:t>
+        <w:spacing w:line="240" w:lineRule="auto"/>
+      </w:pPr>
+      <w:r>
+        <w:t xml:space="preserve">The central question is not simply whether a GPU can execute AES quickly, but </w:t>
+      </w:r>
+      <w:r>
+        <w:rPr>
+          <w:i/>
+        </w:rPr>
+        <w:t>where a measured advantage exists and what must change in data placement for an application to exploit it</w:t>
+      </w:r>
+      <w:r>
+        <w:t xml:space="preserve">. A GPU-resident input can be encrypted without round-trip payload movement. A CPU-resident input that must return to host memory after GPU encryption requires two transfers. These are distinct workflows and must not be described by a single generic </w:t>
+      </w:r>
+      <w:r>
+        <w:t>“</w:t>
+      </w:r>
+      <w:r>
+        <w:t>GPU speedup.</w:t>
+      </w:r>
+      <w:r>
+        <w:t>”</w:t>
       </w:r>
     </w:p>
     <w:p>
       <w:pPr>
         <w:pStyle w:val="JText"/>
-      </w:pPr>
-      <w:r>
-        <w:t>This distinction also affects the interpretation of potential processing strategies. Encrypting a contiguous buffer, aggregating independent requests, and operating on device-resident data involve different data-placement and execution costs. Batching may provide more parallel work per invocation, but its usefulness depends on workload size and application latency requirements. A favorable result for one execution boundary does not establish an advantage for the others; each must be assessed against the available host implementation.</w:t>
+        <w:spacing w:line="240" w:lineRule="auto"/>
+      </w:pPr>
+      <w:r>
+        <w:t>The study makes three bounded contributions. First, it establishes a same-runtime comparison with native OpenSSL EVP AES-NI, correcting the interpretation of earlier comparisons that used PyCryptodome as their host reference. Second, it quantifies how a GPU compute-only advantage for 32</w:t>
+      </w:r>
+      <w:r>
+        <w:t xml:space="preserve"> </w:t>
+      </w:r>
+      <w:r>
+        <w:t>MiB CTR is lost at a prepared transfer-inclusive boundary. Third, it validates independent nonce/counter domains per page and shows that their GPU processing cost is close to the cost of a continuous stream of equal length. The contribution is a measured execution-placement distinction and a reproducible page-aware implementation, not a new AES primitive or a demonstrated complete storage-engine speedup.</w:t>
       </w:r>
     </w:p>
     <w:p>
       <w:pPr>
         <w:pStyle w:val="JText"/>
-      </w:pPr>
-      <w:r>
-        <w:t>The study evaluates validated AES-128 implementations in Electronic Codebook (ECB) and CTR modes across three heterogeneous computing configurations. CTR is the primary workload of interest, while ECB provides a controlled reference for independent block processing. Hardware-assisted CPU AES-NI serves as the baseline. Cryptographic correctness verification, controlled inputs, paired execution conditions, repeated measurement sessions, and explicit timing boundaries support the comparison. Section</w:t>
+        <w:spacing w:line="240" w:lineRule="auto"/>
+      </w:pPr>
+      <w:r>
+        <w:t>Previously recorded measurements on GTX 1650 Ti, T600 and Tesla T4 are retained as historical, implementation-specific evidence. New same-runtime T4 CPU/GPU and page-batching sessions are presented separately; their observations are not pooled with the earlier data. Section</w:t>
       </w:r>
       <w:r>
         <w:t xml:space="preserve"> </w:t>
@@ -229,82 +401,31 @@
         <w:t>3</w:t>
       </w:r>
       <w:r>
-        <w:t xml:space="preserve"> specifies the implementations, workload sizes, and session-level analysis.</w:t>
-      </w:r>
-    </w:p>
-    <w:p>
-      <w:pPr>
-        <w:pStyle w:val="JText"/>
-      </w:pPr>
-      <w:r>
-        <w:t>The contribution is experimental evidence identifying conditions under which GPU-assisted bulk AES processing improves throughput, including cases where an advantage remains after synchronous data movement. The measurements also identify configurations in which transfer costs or host implementation characteristics prevent consistent improvement. The common validation and measurement protocol provides a reproducible basis for assessing these outcomes across the tested systems. The study evaluates existing encryption approaches rather than introducing a new AES algorithm. Both favorable and unfavorable acceleration outcomes are used to delimit the operating conditions supported by the measurements. The results characterize the evaluated CPU and GPU paths; they do not establish a universal hardware advantage or the maximum throughput attainable by either architecture.</w:t>
-      </w:r>
-    </w:p>
-    <w:p>
-      <w:pPr>
-        <w:pStyle w:val="JText"/>
-      </w:pPr>
-      <w:r>
-        <w:t>For telecommunications, bulk data protection, workload aggregation, and device-resident processing are potential applications of these findings. Their application-level effectiveness remains untested. In particular, improved AES-CTR buffer processing does not demonstrate acceleration of complete network security protocols. Authenticated encryption additionally requires authentication processing, while practical protocols introduce packet handling, cryptographic state management, and data-delivery costs. These operations, along with batching and queueing latency, require separate evaluation before the measured bulk-processing improvements can be extended to telecommunications applications.</w:t>
-      </w:r>
-    </w:p>
-    <w:p>
-      <w:pPr>
-        <w:pStyle w:val="JText"/>
-      </w:pPr>
-      <w:r>
-        <w:t>Section</w:t>
+        <w:t xml:space="preserve"> defines the measurement boundaries, Section</w:t>
       </w:r>
       <w:r>
         <w:t xml:space="preserve"> </w:t>
       </w:r>
       <w:r>
-        <w:t>2</w:t>
-      </w:r>
-      <w:r>
-        <w:t xml:space="preserve"> reviews GPU AES implementations, CPU</w:t>
-      </w:r>
-      <w:r>
-        <w:t>–</w:t>
-      </w:r>
-      <w:r>
-        <w:t>GPU comparison methods, and the evidence needed to assess offloading. Section</w:t>
+        <w:t>4</w:t>
+      </w:r>
+      <w:r>
+        <w:t xml:space="preserve"> presents the positive and negative results together, and Sections</w:t>
       </w:r>
       <w:r>
         <w:t xml:space="preserve"> </w:t>
       </w:r>
       <w:r>
-        <w:t>3</w:t>
-      </w:r>
-      <w:r>
-        <w:t xml:space="preserve"> describes the experimental design, validation, timing boundaries, and statistical analysis. Section</w:t>
-      </w:r>
-      <w:r>
-        <w:t xml:space="preserve"> </w:t>
-      </w:r>
-      <w:r>
-        <w:t>4</w:t>
-      </w:r>
-      <w:r>
-        <w:t xml:space="preserve"> presents the measured acceleration outcomes, and Section</w:t>
-      </w:r>
-      <w:r>
-        <w:t xml:space="preserve"> </w:t>
-      </w:r>
-      <w:r>
         <w:t>5</w:t>
       </w:r>
       <w:r>
-        <w:t xml:space="preserve"> examines their practical constraints and potential telecommunications applications. Section</w:t>
-      </w:r>
-      <w:r>
-        <w:t xml:space="preserve"> </w:t>
+        <w:t xml:space="preserve"> and </w:t>
       </w:r>
       <w:r>
         <w:t>6</w:t>
       </w:r>
       <w:r>
-        <w:t xml:space="preserve"> summarizes the findings.</w:t>
+        <w:t xml:space="preserve"> discuss the practical conditions and remaining work.</w:t>
       </w:r>
     </w:p>
     <w:p>
@@ -322,6 +443,7 @@
     <w:p>
       <w:pPr>
         <w:pStyle w:val="JText"/>
+        <w:spacing w:line="240" w:lineRule="auto"/>
       </w:pPr>
       <w:r>
         <w:t>Early contributions by Manavski</w:t>
@@ -357,6 +479,7 @@
     <w:p>
       <w:pPr>
         <w:pStyle w:val="JText"/>
+        <w:spacing w:line="240" w:lineRule="auto"/>
       </w:pPr>
       <w:r>
         <w:t>Iwai et al.</w:t>
@@ -422,6 +545,7 @@
     <w:p>
       <w:pPr>
         <w:pStyle w:val="JText"/>
+        <w:spacing w:line="240" w:lineRule="auto"/>
       </w:pPr>
       <w:r>
         <w:t>More recent work has explored bit-sliced cipher representations. A 2024 study</w:t>
@@ -439,6 +563,7 @@
     <w:p>
       <w:pPr>
         <w:pStyle w:val="JText"/>
+        <w:spacing w:line="240" w:lineRule="auto"/>
       </w:pPr>
       <w:r>
         <w:t>That comparison depends on the CPU implementation. Dedicated instructions such as AES-NI reduce the cost of AES transformations</w:t>
@@ -465,6 +590,7 @@
     <w:p>
       <w:pPr>
         <w:pStyle w:val="JText"/>
+        <w:spacing w:line="240" w:lineRule="auto"/>
       </w:pPr>
       <w:r>
         <w:t>Data location further determines which costs enter that decision. Gregg and Hazelwood</w:t>
@@ -512,6 +638,7 @@
     <w:p>
       <w:pPr>
         <w:pStyle w:val="JText"/>
+        <w:spacing w:line="240" w:lineRule="auto"/>
       </w:pPr>
       <w:r>
         <w:t>For communication infrastructure, these findings connect encryption performance to the surrounding processing path. A host-managed interface may receive data, organize buffers, invoke encryption, and forward the output. The resulting costs differ between contiguous buffers, aggregated independent messages, and individual latency-sensitive packets. Device-resident measurements and transfer-inclusive measurements therefore answer different questions. The present study distinguishes resident execution from a synchronous prepared-buffer pipeline containing host-to-device and device-to-host transfers. This pipeline measures a broader operation than the kernel alone, but excludes complete network input/output and application processing; it also does not evaluate transfer</w:t>
@@ -526,6 +653,7 @@
     <w:p>
       <w:pPr>
         <w:pStyle w:val="JText"/>
+        <w:spacing w:line="240" w:lineRule="auto"/>
       </w:pPr>
       <w:r>
         <w:t>Telecommunications security adds requirements beyond encryption throughput. AES-GCM combines counter-mode encryption with GHASH authentication</w:t>
@@ -543,6 +671,7 @@
     <w:p>
       <w:pPr>
         <w:pStyle w:val="JText"/>
+        <w:spacing w:line="240" w:lineRule="auto"/>
       </w:pPr>
       <w:r>
         <w:t>Earlier research also examined GPU-assisted encryption in communication protocols. Sch</w:t>
@@ -590,6 +719,7 @@
     <w:p>
       <w:pPr>
         <w:pStyle w:val="JText"/>
+        <w:spacing w:line="240" w:lineRule="auto"/>
       </w:pPr>
       <w:r>
         <w:t>Workload aggregation introduces a further throughput</w:t>
@@ -604,6 +734,7 @@
     <w:p>
       <w:pPr>
         <w:pStyle w:val="JText"/>
+        <w:spacing w:line="240" w:lineRule="auto"/>
       </w:pPr>
       <w:r>
         <w:t>Assessing whether an observed advantage is repeatable also requires control of experimental variability. Mytkowicz et al.</w:t>
@@ -639,6 +770,7 @@
     <w:p>
       <w:pPr>
         <w:pStyle w:val="JText"/>
+        <w:spacing w:line="240" w:lineRule="auto"/>
       </w:pPr>
       <w:r>
         <w:t>The present evaluation applies these principles through cryptographic validation, paired workloads, repeated study sessions, documented timing boundaries, and preservation of raw observations and experimental provenance. Session-level evidence distinguishes isolated favorable measurements from advantages observed consistently across executions, while retaining outcomes that favor the CPU. Detailed procedures and aggregation equations are given in Section</w:t>
@@ -656,6 +788,7 @@
     <w:p>
       <w:pPr>
         <w:pStyle w:val="JText"/>
+        <w:spacing w:line="240" w:lineRule="auto"/>
       </w:pPr>
       <w:r>
         <w:t>The literature thus establishes GPU AES feasibility, optimization techniques, and the need to account for transfers, CPU acceleration, and measurement variability. The question addressed here is which operating conditions produce a repeatable bulk-processing benefit when the host already supports hardware-assisted encryption. High kernel throughput alone cannot answer this question, and an unfavorable transfer-inclusive result on one system cannot settle it for other platforms or workloads.</w:t>
@@ -664,6 +797,7 @@
     <w:p>
       <w:pPr>
         <w:pStyle w:val="JText"/>
+        <w:spacing w:line="240" w:lineRule="auto"/>
       </w:pPr>
       <w:r>
         <w:t>To examine these conditions, the study compares AES-128 ECB and CTR workloads of different sizes across three heterogeneous configurations under a common validation and measurement protocol. The comparison uses hardware-assisted CPU AES-NI as its reference and retains session-level measurements for assessing consistency across repeated executions. Its contribution is the identification of experimentally supported operating conditions in which GPU-assisted bulk AES processing provides an advantage, together with evidence of constraints under which that advantage disappears or becomes inconsistent. This supports assessment of GPU-assisted bulk encryption and workload placement within the tested execution boundaries. Extending those findings to authenticated encryption and network processing requires separate application-level measurements.</w:t>
@@ -684,6 +818,7 @@
     <w:p>
       <w:pPr>
         <w:pStyle w:val="JText"/>
+        <w:spacing w:line="240" w:lineRule="auto"/>
       </w:pPr>
       <w:r>
         <w:t>The evaluation compares AES-128 encryption using hardware-assisted CPU AES-NI and a validated CUDA implementation. CTR is the primary workload; ECB provides a controlled reference for mode-dependent implementation behavior. Both modes process contiguous buffers under the same validation and measurement protocol. Three complete hardware</w:t>
@@ -1016,6 +1151,7 @@
     <w:p>
       <w:pPr>
         <w:pStyle w:val="JText"/>
+        <w:spacing w:line="240" w:lineRule="auto"/>
       </w:pPr>
       <w:r>
         <w:t xml:space="preserve">The CPU reference uses PyCryptodome with hardware-assisted AES-NI explicitly enabled </w:t>
@@ -1057,6 +1193,7 @@
     <w:p>
       <w:pPr>
         <w:pStyle w:val="JText"/>
+        <w:spacing w:line="240" w:lineRule="auto"/>
       </w:pPr>
       <w:r>
         <w:t xml:space="preserve">Cryptographic validation precedes acceptance of timing measurements. Known-answer tests and consistency checks against CPU reference operations use the AES specification and mode definitions </w:t>
@@ -1071,6 +1208,7 @@
     <w:p>
       <w:pPr>
         <w:pStyle w:val="JText"/>
+        <w:spacing w:line="240" w:lineRule="auto"/>
       </w:pPr>
       <w:r>
         <w:t>The archived harness validates each measured output against the CPU reference outside the timed call, in addition to the initial validation gate. An output mismatch stops performance export. For each size, mode, and repetition, a single synthetic message is replayed across the paired backends. Plaintext and a 16-byte key are generated from the seeded random generator. The initial CTR block consists of eight generated bytes followed by eight zero bytes. The CPU CTR call uses an empty nonce and interprets the full initial counter as a big-endian integer.</w:t>
@@ -1079,6 +1217,7 @@
     <w:p>
       <w:pPr>
         <w:pStyle w:val="JText"/>
+        <w:spacing w:line="240" w:lineRule="auto"/>
       </w:pPr>
       <w:r>
         <w:t>Pair identifiers record size, mode, and repetition. A SHA-256 digest of the concatenated key, counter, and plaintext records the common input material. Raw records also retain the session identifier, seed, backend, mode, measurement scope, job order, global execution order, and validation flag. These fields allow the selected CPU and GPU observations to be matched without pooling observations from different sessions. Previous output buffers are released outside the next timed call.</w:t>
@@ -1087,6 +1226,7 @@
     <w:p>
       <w:pPr>
         <w:pStyle w:val="JText"/>
+        <w:spacing w:line="240" w:lineRule="auto"/>
       </w:pPr>
       <w:r>
         <w:t>The retained dataset is checked against the archived file hashes. For each platform, mode, size, and repetition, the selected observations contain one CPU transformation, one resident GPU measurement, and one pipeline measurement with matching input digests. Each configuration group contains all twenty recorded repetitions. Throughput is independently checked against the corresponding byte count and recorded time before session-level aggregation. Resident records specify one kernel iteration, and the GPU records identify pinned host memory. The verification reconstructs the aggregates from raw records rather than relying solely on the saved summary tables.</w:t>
@@ -1095,6 +1235,7 @@
     <w:p>
       <w:pPr>
         <w:pStyle w:val="JText"/>
+        <w:spacing w:line="240" w:lineRule="auto"/>
       </w:pPr>
       <w:r>
         <w:t>The experiment uses five input sizes:</w:t>
@@ -1103,6 +1244,7 @@
     <w:p>
       <w:pPr>
         <w:pStyle w:val="JEquation"/>
+        <w:spacing w:line="240" w:lineRule="auto"/>
       </w:pPr>
       <w:r>
         <w:tab/>
@@ -1361,6 +1503,7 @@
     <w:p>
       <w:pPr>
         <w:pStyle w:val="JText-noIndent"/>
+        <w:spacing w:line="240" w:lineRule="auto"/>
       </w:pPr>
       <w:r>
         <w:t>Corresponding CPU and GPU executions use deterministic input generation and matching plaintext, encryption keys, and mode-specific parameters. Each platform has five study sessions with random seeds 2003</w:t>
@@ -1375,6 +1518,7 @@
     <w:p>
       <w:pPr>
         <w:pStyle w:val="JEquation"/>
+        <w:spacing w:line="240" w:lineRule="auto"/>
       </w:pPr>
       <w:r>
         <w:tab/>
@@ -1489,6 +1633,7 @@
     <w:p>
       <w:pPr>
         <w:pStyle w:val="JText-noIndent"/>
+        <w:spacing w:line="240" w:lineRule="auto"/>
       </w:pPr>
       <w:r>
         <w:t>raw timing observations across the three systems. Workload sizes execute in ascending order, while mode and backend/</w:t>
@@ -1500,6 +1645,7 @@
     <w:p>
       <w:pPr>
         <w:pStyle w:val="JText"/>
+        <w:spacing w:line="240" w:lineRule="auto"/>
       </w:pPr>
       <w:r>
         <w:t>Three timing boundaries are retained:</w:t>
@@ -1512,6 +1658,7 @@
           <w:ilvl w:val="0"/>
           <w:numId w:val="19"/>
         </w:numPr>
+        <w:spacing w:line="240" w:lineRule="auto"/>
       </w:pPr>
       <w:r>
         <w:rPr>
@@ -1530,6 +1677,7 @@
           <w:ilvl w:val="0"/>
           <w:numId w:val="19"/>
         </w:numPr>
+        <w:spacing w:line="240" w:lineRule="auto"/>
       </w:pPr>
       <w:r>
         <w:rPr>
@@ -1548,6 +1696,7 @@
           <w:ilvl w:val="0"/>
           <w:numId w:val="19"/>
         </w:numPr>
+        <w:spacing w:line="240" w:lineRule="auto"/>
       </w:pPr>
       <w:r>
         <w:rPr>
@@ -1562,6 +1711,7 @@
     <w:p>
       <w:pPr>
         <w:pStyle w:val="JText"/>
+        <w:spacing w:line="240" w:lineRule="auto"/>
       </w:pPr>
       <w:r>
         <w:t xml:space="preserve">CPU execution and the GPU pipeline are timed with Python's monotonic high-resolution </w:t>
@@ -1609,6 +1759,7 @@
     <w:p>
       <w:pPr>
         <w:pStyle w:val="JText"/>
+        <w:spacing w:line="240" w:lineRule="auto"/>
       </w:pPr>
       <w:r>
         <w:t>The prepared-buffer pipeline uses pinned host memory and preallocated device buffers, prepared before the timed interval. Its processing stages are represented as</w:t>
@@ -1617,6 +1768,7 @@
     <w:p>
       <w:pPr>
         <w:pStyle w:val="JEquation"/>
+        <w:spacing w:line="240" w:lineRule="auto"/>
       </w:pPr>
       <w:r>
         <w:tab/>
@@ -1820,6 +1972,7 @@
     <w:p>
       <w:pPr>
         <w:pStyle w:val="JText-noIndent"/>
+        <w:spacing w:line="240" w:lineRule="auto"/>
       </w:pPr>
       <w:r>
         <w:t>where H2D and D2H denote host-to-device and device-to-host transfers, and the final term covers additional costs within the measured boundary. This expression describes the stages of the synchronous operation; it is not a decomposition calculated by adding separately aggregated component measurements. Recorded transfer-component intervals include synchronization effects and are not isolated measurements of physical PCIe transmission time.</w:t>
@@ -1828,6 +1981,7 @@
     <w:p>
       <w:pPr>
         <w:pStyle w:val="JText"/>
+        <w:spacing w:line="240" w:lineRule="auto"/>
       </w:pPr>
       <w:r>
         <w:t>GPU compilation, memory allocation and pinning, initial host-side input staging, key preparation, and application-level input/output are excluded from the pipeline interval. Transfers and computation are not overlapped using multiple asynchronous CUDA streams. Resident execution and prepared-buffer processing are measured separately, with the latter including the movement needed to process a host-resident buffer and return its output. No network input/output, packet aggregation, or authenticated-encryption operation is included in these measurements.</w:t>
@@ -1836,6 +1990,7 @@
     <w:p>
       <w:pPr>
         <w:pStyle w:val="JText"/>
+        <w:spacing w:line="240" w:lineRule="auto"/>
       </w:pPr>
       <w:r>
         <w:t xml:space="preserve">Elapsed processing time, throughput, and host-relative GPU acceleration are summarized at session level. For an input of </w:t>
@@ -1953,6 +2108,7 @@
     <w:p>
       <w:pPr>
         <w:pStyle w:val="JEquation"/>
+        <w:spacing w:line="240" w:lineRule="auto"/>
       </w:pPr>
       <w:r>
         <w:tab/>
@@ -2128,6 +2284,7 @@
     <w:p>
       <w:pPr>
         <w:pStyle w:val="JText-noIndent"/>
+        <w:spacing w:line="240" w:lineRule="auto"/>
       </w:pPr>
       <w:r>
         <w:t>Input sizes use binary KiB and MiB units. Time and throughput medians are calculated independently within each session, then aggregated across the five session estimates:</w:t>
@@ -2136,6 +2293,7 @@
     <w:p>
       <w:pPr>
         <w:pStyle w:val="JEquation"/>
+        <w:spacing w:line="240" w:lineRule="auto"/>
       </w:pPr>
       <w:r>
         <w:tab/>
@@ -2476,6 +2634,7 @@
     <w:p>
       <w:pPr>
         <w:pStyle w:val="JText-noIndent"/>
+        <w:spacing w:line="240" w:lineRule="auto"/>
       </w:pPr>
       <w:r>
         <w:t>Throughput is summarized from the recorded per-repetition throughput values rather than obtained by inverting the aggregated latency statistic. For the corresponding CPU and GPU executions, acceleration is calculated from the paired session-level timing medians:</w:t>
@@ -2484,6 +2643,7 @@
     <w:p>
       <w:pPr>
         <w:pStyle w:val="JEquation"/>
+        <w:spacing w:line="240" w:lineRule="auto"/>
       </w:pPr>
       <w:r>
         <w:tab/>
@@ -2841,6 +3001,7 @@
     <w:p>
       <w:pPr>
         <w:pStyle w:val="JText-noIndent"/>
+        <w:spacing w:line="240" w:lineRule="auto"/>
       </w:pPr>
       <w:r>
         <w:t xml:space="preserve">Here, </w:t>
@@ -3061,6 +3222,7 @@
     <w:p>
       <w:pPr>
         <w:pStyle w:val="JText"/>
+        <w:spacing w:line="240" w:lineRule="auto"/>
       </w:pPr>
       <w:r>
         <w:t xml:space="preserve">The analysis reports session ranges, interquartile ranges, sample coefficients of variation, and counts of sessions with </w:t>
@@ -3156,6 +3318,7 @@
     <w:p>
       <w:pPr>
         <w:pStyle w:val="JText"/>
+        <w:spacing w:line="240" w:lineRule="auto"/>
       </w:pPr>
       <w:r>
         <w:t xml:space="preserve">The use of repeated sessions, paired workloads, and documented execution conditions follows recommendations on experimental bias and hierarchical variability in performance measurement </w:t>
@@ -3165,6 +3328,246 @@
       </w:r>
       <w:r>
         <w:t>. Raw observations and their provenance are retained for verification of the session estimates and acceleration calculations.</w:t>
+      </w:r>
+    </w:p>
+    <w:p>
+      <w:pPr>
+        <w:pStyle w:val="JSubSubTitle"/>
+      </w:pPr>
+      <w:r>
+        <w:t>3.1</w:t>
+        <w:tab/>
+      </w:r>
+      <w:r>
+        <w:t>Native CPU baseline and same-runtime t4 validation</w:t>
+      </w:r>
+    </w:p>
+    <w:p>
+      <w:pPr>
+        <w:pStyle w:val="JText"/>
+        <w:spacing w:line="240" w:lineRule="auto"/>
+      </w:pPr>
+      <w:r>
+        <w:t>The historical three-platform study used a hardware-assisted PyCryptodome host path. A later, independent T4 study compared that path, a native OpenSSL 3 EVP AES-128 implementation, and the original validated CUDA baseline on the same runtime allocation. The five sessions used seeds 2003</w:t>
+      </w:r>
+      <w:r>
+        <w:t>–</w:t>
+      </w:r>
+      <w:r>
+        <w:t>2007, five warm-ups and 20 measurements per size and mode; buffers ranged from 1</w:t>
+      </w:r>
+      <w:r>
+        <w:t xml:space="preserve"> </w:t>
+      </w:r>
+      <w:r>
+        <w:t>KiB to 32</w:t>
+      </w:r>
+      <w:r>
+        <w:t xml:space="preserve"> </w:t>
+      </w:r>
+      <w:r>
+        <w:t>MiB. Results from this newer study are paired only within its own sessions.</w:t>
+      </w:r>
+    </w:p>
+    <w:p>
+      <w:pPr>
+        <w:pStyle w:val="JText"/>
+        <w:spacing w:line="240" w:lineRule="auto"/>
+      </w:pPr>
+      <w:r>
+        <w:t xml:space="preserve">Native </w:t>
+      </w:r>
+      <w:r>
+        <w:rPr>
+          <w:i/>
+        </w:rPr>
+        <w:t>CPU transform time</w:t>
+      </w:r>
+      <w:r>
+        <w:t xml:space="preserve"> was measured inside C around encryption with prepared contexts/output; it excludes the Python-to-C call, allocation and cipher setup. GPU </w:t>
+      </w:r>
+      <w:r>
+        <w:rPr>
+          <w:i/>
+        </w:rPr>
+        <w:t>resident time</w:t>
+      </w:r>
+      <w:r>
+        <w:t xml:space="preserve"> is a CUDA-event compute interval with prepared device buffers. GPU </w:t>
+      </w:r>
+      <w:r>
+        <w:rPr>
+          <w:i/>
+        </w:rPr>
+        <w:t>prepared pipeline time</w:t>
+      </w:r>
+      <w:r>
+        <w:t xml:space="preserve"> includes payload host-to-device transfer, kernel execution, device-to-host transfer and synchronization, but excludes GPU allocation, staging, key expansion and output conversion. These boundaries are useful for determining whether prepared GPU processing repays transfer cost, but they do not provide identical wrapper costs or full application latency. CPU operation-envelope measurements include additional setup/allocation/copying and are retained only as asymmetric diagnostics.</w:t>
+      </w:r>
+    </w:p>
+    <w:p>
+      <w:pPr>
+        <w:pStyle w:val="JSubSubTitle"/>
+      </w:pPr>
+      <w:r>
+        <w:t>3.2</w:t>
+        <w:tab/>
+      </w:r>
+      <w:r>
+        <w:t>Independent-page CTR batch experiment</w:t>
+      </w:r>
+    </w:p>
+    <w:p>
+      <w:pPr>
+        <w:pStyle w:val="JText"/>
+        <w:spacing w:line="240" w:lineRule="auto"/>
+      </w:pPr>
+      <w:r>
+        <w:t xml:space="preserve">A separate T4 campaign encrypted </w:t>
+      </w:r>
+      <m:oMath>
+        <m:box>
+          <m:e>
+            <m:r>
+              <m:rPr>
+                <m:sty m:val="i"/>
+              </m:rPr>
+              <w:rPr>
+                <w:sz w:val="22"/>
+              </w:rPr>
+              <m:t>N</m:t>
+            </m:r>
+            <m:r>
+              <m:rPr>
+                <m:sty m:val="p"/>
+              </m:rPr>
+              <w:rPr>
+                <w:sz w:val="22"/>
+              </w:rPr>
+              <m:t>∈</m:t>
+            </m:r>
+            <m:r>
+              <m:rPr>
+                <m:sty m:val="p"/>
+              </m:rPr>
+              <w:rPr>
+                <w:sz w:val="22"/>
+              </w:rPr>
+              <m:t>{</m:t>
+            </m:r>
+            <m:r>
+              <m:rPr>
+                <m:sty m:val="p"/>
+              </m:rPr>
+              <w:rPr>
+                <w:sz w:val="22"/>
+              </w:rPr>
+              <m:t>1</m:t>
+            </m:r>
+            <m:r>
+              <m:rPr>
+                <m:sty m:val="p"/>
+              </m:rPr>
+              <w:rPr>
+                <w:sz w:val="22"/>
+              </w:rPr>
+              <m:t>,</m:t>
+            </m:r>
+            <m:r>
+              <m:rPr>
+                <m:sty m:val="p"/>
+              </m:rPr>
+              <w:rPr>
+                <w:sz w:val="22"/>
+              </w:rPr>
+              <m:t>4</m:t>
+            </m:r>
+            <m:r>
+              <m:rPr>
+                <m:sty m:val="p"/>
+              </m:rPr>
+              <w:rPr>
+                <w:sz w:val="22"/>
+              </w:rPr>
+              <m:t>,</m:t>
+            </m:r>
+            <m:r>
+              <m:rPr>
+                <m:sty m:val="p"/>
+              </m:rPr>
+              <w:rPr>
+                <w:sz w:val="22"/>
+              </w:rPr>
+              <m:t>16</m:t>
+            </m:r>
+            <m:r>
+              <m:rPr>
+                <m:sty m:val="p"/>
+              </m:rPr>
+              <w:rPr>
+                <w:sz w:val="22"/>
+              </w:rPr>
+              <m:t>,</m:t>
+            </m:r>
+            <m:r>
+              <m:rPr>
+                <m:sty m:val="p"/>
+              </m:rPr>
+              <w:rPr>
+                <w:sz w:val="22"/>
+              </w:rPr>
+              <m:t>32</m:t>
+            </m:r>
+            <m:r>
+              <m:rPr>
+                <m:sty m:val="p"/>
+              </m:rPr>
+              <w:rPr>
+                <w:sz w:val="22"/>
+              </w:rPr>
+              <m:t>}</m:t>
+            </m:r>
+          </m:e>
+        </m:box>
+      </m:oMath>
+      <w:r>
+        <w:t xml:space="preserve"> independently managed 1</w:t>
+      </w:r>
+      <w:r>
+        <w:t xml:space="preserve"> </w:t>
+      </w:r>
+      <w:r>
+        <w:t>MiB pages, for total sizes of 1, 4, 16 and 32</w:t>
+      </w:r>
+      <w:r>
+        <w:t xml:space="preserve"> </w:t>
+      </w:r>
+      <w:r>
+        <w:t xml:space="preserve">MiB. Each page used a separate 96-bit synthetic test nonce concatenated with a 32-bit big-endian initial counter of one. The counter is advanced </w:t>
+      </w:r>
+      <w:r>
+        <w:rPr>
+          <w:i/>
+        </w:rPr>
+        <w:t>within</w:t>
+      </w:r>
+      <w:r>
+        <w:t xml:space="preserve"> each page and never carried into another page's nonce. The page-aware CUDA kernel assigns blocks to their corresponding page and encrypts all pages in one launch using the unchanged historical AES round implementation. A native OpenSSL EVP path processes the page contexts sequentially on one calling CPU thread.</w:t>
+      </w:r>
+    </w:p>
+    <w:p>
+      <w:pPr>
+        <w:pStyle w:val="JText"/>
+        <w:spacing w:line="240" w:lineRule="auto"/>
+      </w:pPr>
+      <w:r>
+        <w:t>An equal-size continuous CTR stream forms the control. For each size and repetition the page and continuous controls share plaintext and key but use distinct nonce domains. The experiment validates ciphertext independently against a CPU reference, including published vectors, page boundaries, counter carry and overflow guards. Five T4 sessions (seeds 2003</w:t>
+      </w:r>
+      <w:r>
+        <w:t>–</w:t>
+      </w:r>
+      <w:r>
+        <w:t>2007) each include five warm-ups and 20 measurements for all four batch sizes, both layouts and three scheduled measurement paths. This yields 2,400 measured observations plus 600 warm-ups. Actual execution order, input digests, source hashes, software versions and session identity are retained. All reported speedups use the CPU duration divided by GPU duration: values greater than one favor the GPU. Five session medians, not pooled individual repetitions, form the primary descriptive replication units. The study is synthetic and measures batch completion rather than application request latency.</w:t>
       </w:r>
     </w:p>
     <w:p>
@@ -3182,6 +3585,7 @@
     <w:p>
       <w:pPr>
         <w:pStyle w:val="JText"/>
+        <w:spacing w:line="240" w:lineRule="auto"/>
       </w:pPr>
       <w:r>
         <w:t>Figure</w:t>
@@ -3276,6 +3680,7 @@
     <w:p>
       <w:pPr>
         <w:pStyle w:val="JText"/>
+        <w:spacing w:line="240" w:lineRule="auto"/>
       </w:pPr>
       <w:r>
         <w:rPr>
@@ -4199,6 +4604,7 @@
     <w:p>
       <w:pPr>
         <w:pStyle w:val="JText-noIndent"/>
+        <w:spacing w:line="240" w:lineRule="auto"/>
       </w:pPr>
       <w:r>
         <w:rPr>
@@ -4210,6 +4616,7 @@
     <w:p>
       <w:pPr>
         <w:pStyle w:val="JText"/>
+        <w:spacing w:line="240" w:lineRule="auto"/>
       </w:pPr>
       <w:r>
         <w:t xml:space="preserve">For T600 CTR, the median pipeline speedup of </w:t>
@@ -4311,6 +4718,7 @@
     <w:p>
       <w:pPr>
         <w:pStyle w:val="JText"/>
+        <w:spacing w:line="240" w:lineRule="auto"/>
       </w:pPr>
       <w:r>
         <w:t>T4 CTR has the largest median pipeline speedup at 32</w:t>
@@ -4424,6 +4832,7 @@
     <w:p>
       <w:pPr>
         <w:pStyle w:val="JText"/>
+        <w:spacing w:line="240" w:lineRule="auto"/>
       </w:pPr>
       <w:r>
         <w:t xml:space="preserve">GTX CTR has a pipeline median of </w:t>
@@ -4576,6 +4985,7 @@
     <w:p>
       <w:pPr>
         <w:pStyle w:val="JText"/>
+        <w:spacing w:line="240" w:lineRule="auto"/>
       </w:pPr>
       <w:r>
         <w:rPr>
@@ -5203,6 +5613,7 @@
     <w:p>
       <w:pPr>
         <w:pStyle w:val="JText"/>
+        <w:spacing w:line="240" w:lineRule="auto"/>
       </w:pPr>
       <w:r>
         <w:t>The T4 GPU rates are nearly identical across modes: approximately 3713</w:t>
@@ -5462,6 +5873,7 @@
     <w:p>
       <w:pPr>
         <w:pStyle w:val="JText"/>
+        <w:spacing w:line="240" w:lineRule="auto"/>
       </w:pPr>
       <w:r>
         <w:t>The smaller workloads in Figure</w:t>
@@ -5497,6 +5909,7 @@
     <w:p>
       <w:pPr>
         <w:pStyle w:val="JText"/>
+        <w:spacing w:line="240" w:lineRule="auto"/>
       </w:pPr>
       <w:r>
         <w:rPr>
@@ -6110,6 +6523,7 @@
     <w:p>
       <w:pPr>
         <w:pStyle w:val="JText"/>
+        <w:spacing w:line="240" w:lineRule="auto"/>
       </w:pPr>
       <w:r>
         <w:t>Absolute throughput is non-monotonic across the size grid. On GTX, throughput at 16</w:t>
@@ -6135,312 +6549,23 @@
     </w:p>
     <w:p>
       <w:pPr>
-        <w:pStyle w:val="JSubtitle"/>
-      </w:pPr>
-      <w:r>
-        <w:t>5</w:t>
+        <w:pStyle w:val="JSubSubTitle"/>
+      </w:pPr>
+      <w:r>
+        <w:t>4.1</w:t>
         <w:tab/>
       </w:r>
       <w:r>
-        <w:t>Discussion</w:t>
-      </w:r>
-    </w:p>
-    <w:p>
-      <w:pPr>
-        <w:pStyle w:val="JSubSubTitle"/>
-      </w:pPr>
-      <w:r>
-        <w:t>5.1</w:t>
-        <w:tab/>
-      </w:r>
-      <w:r>
-        <w:t>Interpretation of experimental findings</w:t>
+        <w:t>Revisiting the host baseline on the tesla t4</w:t>
       </w:r>
     </w:p>
     <w:p>
       <w:pPr>
         <w:pStyle w:val="JText"/>
-      </w:pPr>
-      <w:r>
-        <w:t>The experiments show that GPU-assisted AES-CTR acceleration can persist beyond isolated kernel execution when synchronous host</w:t>
-      </w:r>
-      <w:r>
-        <w:t>–</w:t>
-      </w:r>
-      <w:r>
-        <w:t>device transfers and synchronization are included. The positive prepared-buffer results on T600 and T4 identify favorable bulk-processing conditions for the tested implementations. The T600 result also shows that the observed benefit is not confined to the datacenter-oriented configuration. The GTX pipeline and mode-dependent outcomes establish that resident computational performance alone does not determine whether offloading improves host-observed processing time.</w:t>
-      </w:r>
-    </w:p>
-    <w:p>
-      <w:pPr>
-        <w:pStyle w:val="JText"/>
-      </w:pPr>
-      <w:r>
-        <w:t>CTR permits independent counter-block encryption, provided that counter and nonce requirements are satisfied</w:t>
-      </w:r>
-      <w:r>
-        <w:t xml:space="preserve"> </w:t>
-      </w:r>
-      <w:r>
-        <w:t>[2]</w:t>
-      </w:r>
-      <w:r>
-        <w:t>. This independence supplies parallel work for the CUDA implementation. At 32</w:t>
-      </w:r>
-      <w:r>
-        <w:t xml:space="preserve"> </w:t>
-      </w:r>
-      <w:r>
-        <w:t>MiB, the resident measurements show an advantage over the evaluated AES-NI path on every system in both modes. The pipeline measurements then establish whether an advantage remains within the broader execution boundary. Their lower throughput reflects the additional operations in that boundary, but the measurements do not isolate how much of the difference is attributable to physical transfers, synchronization, or runtime overhead.</w:t>
-      </w:r>
-    </w:p>
-    <w:p>
-      <w:pPr>
-        <w:pStyle w:val="JText"/>
-      </w:pPr>
-      <w:r>
-        <w:t>The host implementation is equally relevant to interpreting acceleration. On T4, similar GPU throughput in ECB and CTR accompanies different host-relative speedups because the corresponding AES-NI rates differ substantially. The CTR speedup therefore characterizes the complete CPU</w:t>
-      </w:r>
-      <w:r>
-        <w:t>–</w:t>
-      </w:r>
-      <w:r>
-        <w:t>GPU comparison; it does not indicate that the GPU executes CTR several times faster than ECB. The underlying cause of the host disparity was not isolated, so attributing it to a processor feature, library behavior, or cloud mechanism would exceed the evidence. The T600 and T4 acceleration factors also use different host processors as their denominators. Their relative magnitudes cannot rank GPU performance independently of the host; absolute throughput and host-relative acceleration must be considered together when comparing the tested configurations.</w:t>
-      </w:r>
-    </w:p>
-    <w:p>
-      <w:pPr>
-        <w:pStyle w:val="JText"/>
-      </w:pPr>
-      <w:r>
-        <w:t>Workload size and session consistency further qualify these findings. Non-monotonic throughput prevents identification of a universal CPU-to-GPU crossover threshold. A positive aggregate speedup can also coexist with sessions favoring the CPU, as observed for T600 ECB. The results support selecting execution paths using workload-specific measurements and paired session outcomes, rather than peak kernel throughput or a single favorable observation. They do not establish that 32</w:t>
-      </w:r>
-      <w:r>
-        <w:t xml:space="preserve"> </w:t>
-      </w:r>
-      <w:r>
-        <w:t>MiB is optimal or that larger buffers would necessarily improve performance.</w:t>
-      </w:r>
-    </w:p>
-    <w:p>
-      <w:pPr>
-        <w:pStyle w:val="JSubSubTitle"/>
-      </w:pPr>
-      <w:r>
-        <w:t>5.2</w:t>
-        <w:tab/>
-      </w:r>
-      <w:r>
-        <w:t>Practical implications and generalizability</w:t>
-      </w:r>
-    </w:p>
-    <w:p>
-      <w:pPr>
-        <w:pStyle w:val="JText"/>
-      </w:pPr>
-      <w:r>
-        <w:t>For telecommunications, the findings provide a basis for evaluating GPU-assisted bulk encryption in communication gateways and server-side data-protection services. Systems already handling substantial contiguous buffers could assess the GPU as an additional execution path alongside AES-NI. This is a potential use of the measured capability, not a demonstrated improvement in a deployed communication service. The relevant comparison must include the operations needed to acquire, organize, protect, and deliver data in the intended application. Where general-purpose GPUs are already present, this could allow bulk encryption to use existing heterogeneous resources without a separate cryptographic accelerator. The measurements support assessing that option against the available hardware-assisted CPU path rather than assuming that an additional accelerator will improve the service.</w:t>
-      </w:r>
-    </w:p>
-    <w:p>
-      <w:pPr>
-        <w:pStyle w:val="JText"/>
-      </w:pPr>
-      <w:r>
-        <w:t>Aggregating independent requests could increase the parallel work available per accelerator invocation, but introduces requirements absent from the buffer experiments. Queueing while a batch forms can increase latency, especially under low traffic. Packet metadata, independent cryptographic contexts, counter allocation, and output ordering must also be maintained. Consequently, a contiguous 32</w:t>
-      </w:r>
-      <w:r>
-        <w:t xml:space="preserve"> </w:t>
-      </w:r>
-      <w:r>
-        <w:t>MiB buffer is not interchangeable with a collection of independently managed packets, and the measurements establish neither an optimal batching policy nor a minimum packet batch size. The relevant trade-off is therefore between the processing benefit of a larger GPU workload and the time spent waiting to assemble and manage it. Requests with strict latency requirements may need a different execution policy from sustained bulk traffic.</w:t>
-      </w:r>
-    </w:p>
-    <w:p>
-      <w:pPr>
-        <w:pStyle w:val="JText"/>
-      </w:pPr>
-      <w:r>
-        <w:t>AES-CTR is specified for IPsec Encapsulating Security Payload (ESP) confidentiality in RFC</w:t>
-      </w:r>
-      <w:r>
-        <w:t xml:space="preserve"> </w:t>
-      </w:r>
-      <w:r>
-        <w:t>3686</w:t>
-      </w:r>
-      <w:r>
-        <w:t xml:space="preserve"> </w:t>
-      </w:r>
-      <w:r>
-        <w:t>[23]</w:t>
-      </w:r>
-      <w:r>
-        <w:t>, while AES-GCM is specified for ESP in RFC</w:t>
-      </w:r>
-      <w:r>
-        <w:t xml:space="preserve"> </w:t>
-      </w:r>
-      <w:r>
-        <w:t>4106</w:t>
-      </w:r>
-      <w:r>
-        <w:t xml:space="preserve"> </w:t>
-      </w:r>
-      <w:r>
-        <w:t>[24]</w:t>
-      </w:r>
-      <w:r>
-        <w:t>. These standards connect the evaluated encryption operation to IPsec-oriented architectures, but the experiments cover neither complete ESP processing nor authenticated encryption. Such processing adds packet framing, security-association state, nonce and sequence-number management, authentication, and delivery. AES-GCM additionally requires GHASH and authentication-tag processing. The measured CTR acceleration cannot determine the throughput of that complete operation.</w:t>
-      </w:r>
-    </w:p>
-    <w:p>
-      <w:pPr>
-        <w:pStyle w:val="JText"/>
-      </w:pPr>
-      <w:r>
-        <w:t>An IPsec extension must preserve counter uniqueness, authentication boundaries, and the association between packet data and protocol metadata when organizing parallel work. Its performance assessment would need to include both throughput and latency across the packet-processing path. Faster counter-mode encryption could benefit that path only to the extent that the remaining operations and their interactions permit an overall improvement.</w:t>
-      </w:r>
-    </w:p>
-    <w:p>
-      <w:pPr>
-        <w:pStyle w:val="JText"/>
-      </w:pPr>
-      <w:r>
-        <w:t>Device-resident processing offers another possible arrangement when input data are already available on the GPU. The resident measurements characterize encryption under this placement, while application acquisition, authentication, and delivery remain to be evaluated. Similar questions could arise in other data-intensive industries, such as storage or analytics services processing large buffers. These are plausible extensions of the workload structure, not validated application results. A workload-aware architecture retaining CPU processing for smaller or latency-sensitive requests and considering GPU execution for bulk work remains an untested design implication.</w:t>
-      </w:r>
-    </w:p>
-    <w:p>
-      <w:pPr>
-        <w:pStyle w:val="JSubSubTitle"/>
-      </w:pPr>
-      <w:r>
-        <w:t>5.3</w:t>
-        <w:tab/>
-      </w:r>
-      <w:r>
-        <w:t>Study limitations</w:t>
-      </w:r>
-    </w:p>
-    <w:p>
-      <w:pPr>
-        <w:pStyle w:val="JText"/>
-      </w:pPr>
-      <w:r>
-        <w:t>Each configuration represents one host or cloud allocation with five study sessions. The observations establish repeatability within those environments, not performance across a population of comparable machines. Differences among the hardware and software configurations were not independently controlled, preventing causal attribution to a single component. The selected AES-NI library path and validated CUDA kernel also do not establish the fastest attainable CPU or GPU implementations, including multithreaded CPU services.</w:t>
-      </w:r>
-    </w:p>
-    <w:p>
-      <w:pPr>
-        <w:pStyle w:val="JText"/>
-      </w:pPr>
-      <w:r>
-        <w:t>The prepared-buffer boundary excludes application-level work and preparation costs specified in Section</w:t>
-      </w:r>
-      <w:r>
-        <w:t xml:space="preserve"> </w:t>
-      </w:r>
-      <w:r>
-        <w:t>3</w:t>
-      </w:r>
-      <w:r>
-        <w:t>. Its throughput is therefore not complete telecommunications-system throughput. The fixed ascending size order confounds buffer-size effects with possible time-dependent execution behavior; the local 16</w:t>
-      </w:r>
-      <w:r>
-        <w:t xml:space="preserve"> </w:t>
-      </w:r>
-      <w:r>
-        <w:t>MiB reduction cannot be assigned to memory effects, scheduling, clocks, or thermal conditions from these measurements. Five-session ranges and directional consistency are descriptive evidence rather than confidence intervals or formal significance tests. These limits constrain both causal explanations and predictions of performance beyond the tested execution paths.</w:t>
-      </w:r>
-    </w:p>
-    <w:p>
-      <w:pPr>
-        <w:pStyle w:val="JSubSubTitle"/>
-      </w:pPr>
-      <w:r>
-        <w:t>5.4</w:t>
-        <w:tab/>
-      </w:r>
-      <w:r>
-        <w:t>Future research</w:t>
-      </w:r>
-    </w:p>
-    <w:p>
-      <w:pPr>
-        <w:pStyle w:val="JText"/>
-      </w:pPr>
-      <w:r>
-        <w:t>Three extensions follow directly from the measured acceleration and its constraints.</w:t>
-      </w:r>
-    </w:p>
-    <w:p>
-      <w:pPr>
-        <w:pStyle w:val="JText"/>
-      </w:pPr>
-      <w:r>
-        <w:t>First, implement and evaluate an IPsec-oriented authenticated-encryption pipeline, including AES-GCM, GHASH, tag processing, and protocol state. A representative gateway workload should include packet preparation and delivery and compare complete throughput and latency with a hardware-assisted CPU implementation. This would test whether the observed encryption-component advantage survives the additional work required by the protocol.</w:t>
-      </w:r>
-    </w:p>
-    <w:p>
-      <w:pPr>
-        <w:pStyle w:val="JText"/>
-      </w:pPr>
-      <w:r>
-        <w:t>Second, evaluate packet aggregation and workload-aware CPU</w:t>
-      </w:r>
-      <w:r>
-        <w:t>–</w:t>
-      </w:r>
-      <w:r>
-        <w:t>GPU selection under varying traffic volume and latency requirements. The study should retain independent cryptographic contexts and output ordering while measuring queueing delay as well as processing time. More densely sampled workload sizes and additional independent systems would help assess whether a selection policy remains effective beyond the current size grid and host allocations.</w:t>
-      </w:r>
-    </w:p>
-    <w:p>
-      <w:pPr>
-        <w:pStyle w:val="JText"/>
-      </w:pPr>
-      <w:r>
-        <w:t>Third, compare the synchronous pipeline with overlapping transfers and computation, persistent device-resident processing, and supported direct-data-transfer mechanisms. Measurements should separate the relevant processing stages while also reporting the complete application interval. This would determine whether changing data placement and transfer scheduling alters the conditions favoring GPU execution; the present synchronous results alone do not predict those gains.</w:t>
-      </w:r>
-    </w:p>
-    <w:p>
-      <w:pPr>
-        <w:pStyle w:val="JSubtitle"/>
-      </w:pPr>
-      <w:r>
-        <w:t>6</w:t>
-        <w:tab/>
-      </w:r>
-      <w:r>
-        <w:t>Conclusion</w:t>
-      </w:r>
-    </w:p>
-    <w:p>
-      <w:pPr>
-        <w:pStyle w:val="JText"/>
-      </w:pPr>
-      <w:r>
-        <w:t>This study experimentally compared validated GPU-assisted AES-128 ECB and CTR encryption with hardware-assisted CPU AES-NI across three heterogeneous configurations. It distinguished device-resident execution from a prepared-buffer pipeline containing synchronous host</w:t>
-      </w:r>
-      <w:r>
-        <w:t>–</w:t>
-      </w:r>
-      <w:r>
-        <w:t>device transfers and synchronization, using paired measurements across repeated sessions.</w:t>
-      </w:r>
-    </w:p>
-    <w:p>
-      <w:pPr>
-        <w:pStyle w:val="JText"/>
-      </w:pPr>
-      <w:r>
-        <w:t>For 32</w:t>
-      </w:r>
-      <w:r>
-        <w:t xml:space="preserve"> </w:t>
-      </w:r>
-      <w:r>
-        <w:t xml:space="preserve">MiB AES-CTR buffers, the pipeline achieved median paired accelerations of </w:t>
+        <w:spacing w:line="240" w:lineRule="auto"/>
+      </w:pPr>
+      <w:r>
+        <w:t xml:space="preserve">The historical </w:t>
       </w:r>
       <m:oMath>
         <m:box>
@@ -6452,7 +6577,7 @@
               <w:rPr>
                 <w:sz w:val="22"/>
               </w:rPr>
-              <m:t>1.354</m:t>
+              <m:t>4.761</m:t>
             </m:r>
             <m:r>
               <m:rPr>
@@ -6467,7 +6592,22 @@
         </m:box>
       </m:oMath>
       <w:r>
-        <w:t xml:space="preserve"> on T600 and </w:t>
+        <w:t xml:space="preserve"> T4 CTR speedup in the preceding tables is an </w:t>
+      </w:r>
+      <w:r>
+        <w:rPr>
+          <w:i/>
+        </w:rPr>
+        <w:t>earlier PyCryptodome-relative result</w:t>
+      </w:r>
+      <w:r>
+        <w:t>, not a speedup relative to an optimized native OpenSSL implementation. In a new five-session T4 campaign, 32</w:t>
+      </w:r>
+      <w:r>
+        <w:t xml:space="preserve"> </w:t>
+      </w:r>
+      <w:r>
+        <w:t xml:space="preserve">MiB AES-128-CTR yields a </w:t>
       </w:r>
       <m:oMath>
         <m:box>
@@ -6479,7 +6619,7 @@
               <w:rPr>
                 <w:sz w:val="22"/>
               </w:rPr>
-              <m:t>4.761</m:t>
+              <m:t>5.586</m:t>
             </m:r>
             <m:r>
               <m:rPr>
@@ -6494,21 +6634,1691 @@
         </m:box>
       </m:oMath>
       <w:r>
-        <w:t xml:space="preserve"> on T4 relative to their respective host implementations. Both improvements occurred in all five sessions, including on the tested 4</w:t>
+        <w:t xml:space="preserve"> median session ratio against PyCryptodome but only </w:t>
+      </w:r>
+      <m:oMath>
+        <m:box>
+          <m:e>
+            <m:r>
+              <m:rPr>
+                <m:sty m:val="p"/>
+              </m:rPr>
+              <w:rPr>
+                <w:sz w:val="22"/>
+              </w:rPr>
+              <m:t>0.942</m:t>
+            </m:r>
+            <m:r>
+              <m:rPr>
+                <m:sty m:val="p"/>
+              </m:rPr>
+              <w:rPr>
+                <w:sz w:val="22"/>
+              </w:rPr>
+              <m:t>×</m:t>
+            </m:r>
+          </m:e>
+        </m:box>
+      </m:oMath>
+      <w:r>
+        <w:t xml:space="preserve"> against native OpenSSL when the GPU prepared pipeline is the denominator. The OpenSSL transform throughput is approximately 3.874</w:t>
       </w:r>
       <w:r>
         <w:t xml:space="preserve"> </w:t>
       </w:r>
       <w:r>
-        <w:t>GB T600 GPU. Resident execution outperformed AES-NI at this size on every system in both modes, but the GTX pipeline did not show a consistent advantage, and T4 ECB remained slower than its CPU reference. Thus, a computational advantage survived data movement for selected CTR workloads, while the outcome depended on the system, mode, and execution boundary.</w:t>
+        <w:t>GB/s and the GPU prepared-pipeline throughput is approximately 3.646</w:t>
+      </w:r>
+      <w:r>
+        <w:t xml:space="preserve"> </w:t>
+      </w:r>
+      <w:r>
+        <w:t xml:space="preserve">GB/s. When only GPU resident computation is considered, the native OpenSSL CPU/GPU ratio is </w:t>
+      </w:r>
+      <m:oMath>
+        <m:box>
+          <m:e>
+            <m:r>
+              <m:rPr>
+                <m:sty m:val="p"/>
+              </m:rPr>
+              <w:rPr>
+                <w:sz w:val="22"/>
+              </w:rPr>
+              <m:t>2.299</m:t>
+            </m:r>
+            <m:r>
+              <m:rPr>
+                <m:sty m:val="p"/>
+              </m:rPr>
+              <w:rPr>
+                <w:sz w:val="22"/>
+              </w:rPr>
+              <m:t>×</m:t>
+            </m:r>
+          </m:e>
+        </m:box>
+      </m:oMath>
+      <w:r>
+        <w:t>. Thus the improved CPU baseline reverses the prepared-pipeline ranking, without implying that the historical measurements were incorrect.</w:t>
+      </w:r>
+    </w:p>
+    <w:p>
+      <w:pPr>
+        <w:pStyle w:val="JSubSubTitle"/>
+      </w:pPr>
+      <w:r>
+        <w:t>4.2</w:t>
+        <w:tab/>
+      </w:r>
+      <w:r>
+        <w:t>Independent pages: a compute advantage that does not survive transfers</w:t>
       </w:r>
     </w:p>
     <w:p>
       <w:pPr>
         <w:pStyle w:val="JText"/>
-      </w:pPr>
-      <w:r>
-        <w:t>These findings establish measured operating conditions for GPU-assisted bulk encryption alongside existing CPU acceleration. They could inform workload placement in telecommunications gateways and other services handling large data buffers, including storage and analytics applications. Their relevance rests on matching the application's workload and data placement to the evaluated conditions. The experiments do not establish improved IPsec ESP, AES-GCM, packet-batching, or complete application performance. Future work should explore an IPsec-oriented authenticated-encryption prototype evaluated across the full packet-processing path. Measuring its throughput and latency with authentication, protocol state, packet aggregation, and delivery included would determine whether the demonstrated bulk AES-CTR improvement translates into an application-level benefit.</w:t>
+        <w:spacing w:line="240" w:lineRule="auto"/>
+      </w:pPr>
+      <w:r>
+        <w:rPr>
+          <w:b/>
+        </w:rPr>
+        <w:t>Table</w:t>
+      </w:r>
+      <w:r>
+        <w:rPr>
+          <w:b/>
+        </w:rPr>
+        <w:t xml:space="preserve"> </w:t>
+      </w:r>
+      <w:r>
+        <w:rPr>
+          <w:b/>
+        </w:rPr>
+        <w:t>5</w:t>
+      </w:r>
+      <w:r>
+        <w:t xml:space="preserve"> gives the prespecified native OpenSSL transform to prepared CUDA pipeline time ratios in the page-batching study. Every reported ratio is below unity across all five sessions. The gap narrows at larger batch sizes but does not reverse direction.</w:t>
+      </w:r>
+    </w:p>
+    <w:p>
+      <w:pPr>
+        <w:pStyle w:val="JFigure"/>
+        <w:keepNext/>
+      </w:pPr>
+      <w:r>
+        <w:rPr>
+          <w:b/>
+        </w:rPr>
+        <w:t>Table 5</w:t>
+      </w:r>
+      <w:r>
+        <w:br/>
+      </w:r>
+      <w:r>
+        <w:rPr>
+          <w:i/>
+        </w:rPr>
+        <w:t>Tesla T4 Phase 2: median of five session-level CPU OpenSSL transform / GPU prepared-pipeline ratios. Values below one favor the CPU at this boundary.</w:t>
+      </w:r>
+    </w:p>
+    <w:tbl>
+      <w:tblPr>
+        <w:tblW w:w="7088" w:type="dxa"/>
+        <w:jc w:val="center"/>
+        <w:tblBorders>
+          <w:top w:val="single" w:sz="6" w:space="0" w:color="auto"/>
+          <w:left w:val="single" w:sz="6" w:space="0" w:color="auto"/>
+          <w:bottom w:val="single" w:sz="6" w:space="0" w:color="auto"/>
+          <w:right w:val="single" w:sz="6" w:space="0" w:color="auto"/>
+          <w:insideH w:val="single" w:sz="4" w:space="0" w:color="auto"/>
+          <w:insideV w:val="single" w:sz="4" w:space="0" w:color="auto"/>
+        </w:tblBorders>
+        <w:tblLayout w:type="fixed"/>
+        <w:tblLook w:val="01E0" w:firstRow="1" w:lastRow="1" w:firstColumn="1" w:lastColumn="1" w:noHBand="0" w:noVBand="0"/>
+      </w:tblPr>
+      <w:tblGrid>
+        <w:gridCol w:w="1898"/>
+        <w:gridCol w:w="2025"/>
+        <w:gridCol w:w="3164"/>
+      </w:tblGrid>
+      <w:tr>
+        <w:trPr>
+          <w:cantSplit/>
+          <w:tblHeader/>
+        </w:trPr>
+        <w:tc>
+          <w:tcPr>
+            <w:tcW w:type="dxa" w:w="1898"/>
+            <w:vAlign w:val="center"/>
+          </w:tcPr>
+          <w:p>
+            <w:pPr>
+              <w:pStyle w:val="JTableText"/>
+              <w:keepNext/>
+              <w:keepLines/>
+              <w:ind w:firstLine="0"/>
+              <w:jc w:val="right"/>
+            </w:pPr>
+            <w:r>
+              <w:t>Total payload</w:t>
+            </w:r>
+          </w:p>
+        </w:tc>
+        <w:tc>
+          <w:tcPr>
+            <w:tcW w:type="dxa" w:w="2025"/>
+            <w:vAlign w:val="center"/>
+          </w:tcPr>
+          <w:p>
+            <w:pPr>
+              <w:pStyle w:val="JTableText"/>
+              <w:keepNext/>
+              <w:keepLines/>
+              <w:ind w:firstLine="0"/>
+              <w:jc w:val="right"/>
+            </w:pPr>
+            <w:r>
+              <w:t>Continuous CTR</w:t>
+            </w:r>
+          </w:p>
+        </w:tc>
+        <w:tc>
+          <w:tcPr>
+            <w:tcW w:type="dxa" w:w="3164"/>
+            <w:vAlign w:val="center"/>
+          </w:tcPr>
+          <w:p>
+            <w:pPr>
+              <w:pStyle w:val="JTableText"/>
+              <w:keepNext/>
+              <w:keepLines/>
+              <w:ind w:firstLine="0"/>
+              <w:jc w:val="right"/>
+            </w:pPr>
+            <w:r>
+              <w:t>Independent 1</w:t>
+            </w:r>
+            <w:r>
+              <w:t xml:space="preserve"> </w:t>
+            </w:r>
+            <w:r>
+              <w:t>MiB pages</w:t>
+            </w:r>
+          </w:p>
+        </w:tc>
+      </w:tr>
+      <w:tr>
+        <w:trPr>
+          <w:cantSplit/>
+        </w:trPr>
+        <w:tc>
+          <w:tcPr>
+            <w:tcW w:type="dxa" w:w="1898"/>
+            <w:vAlign w:val="center"/>
+          </w:tcPr>
+          <w:p>
+            <w:pPr>
+              <w:pStyle w:val="JTableText"/>
+              <w:keepNext/>
+              <w:keepLines/>
+              <w:ind w:firstLine="0"/>
+              <w:jc w:val="right"/>
+            </w:pPr>
+            <w:r>
+              <w:t>1</w:t>
+            </w:r>
+            <w:r>
+              <w:t xml:space="preserve"> </w:t>
+            </w:r>
+            <w:r>
+              <w:t>MiB</w:t>
+            </w:r>
+          </w:p>
+        </w:tc>
+        <w:tc>
+          <w:tcPr>
+            <w:tcW w:type="dxa" w:w="2025"/>
+            <w:vAlign w:val="center"/>
+          </w:tcPr>
+          <w:p>
+            <w:pPr>
+              <w:pStyle w:val="JTableText"/>
+              <w:keepNext/>
+              <w:keepLines/>
+              <w:ind w:firstLine="0"/>
+              <w:jc w:val="right"/>
+            </w:pPr>
+            <w:r>
+              <w:t>0.5437</w:t>
+            </w:r>
+          </w:p>
+        </w:tc>
+        <w:tc>
+          <w:tcPr>
+            <w:tcW w:type="dxa" w:w="3164"/>
+            <w:vAlign w:val="center"/>
+          </w:tcPr>
+          <w:p>
+            <w:pPr>
+              <w:pStyle w:val="JTableText"/>
+              <w:keepNext/>
+              <w:keepLines/>
+              <w:ind w:firstLine="0"/>
+              <w:jc w:val="right"/>
+            </w:pPr>
+            <w:r>
+              <w:t>0.5404</w:t>
+            </w:r>
+          </w:p>
+        </w:tc>
+      </w:tr>
+      <w:tr>
+        <w:trPr>
+          <w:cantSplit/>
+        </w:trPr>
+        <w:tc>
+          <w:tcPr>
+            <w:tcW w:type="dxa" w:w="1898"/>
+            <w:vAlign w:val="center"/>
+          </w:tcPr>
+          <w:p>
+            <w:pPr>
+              <w:pStyle w:val="JTableText"/>
+              <w:keepNext/>
+              <w:keepLines/>
+              <w:ind w:firstLine="0"/>
+              <w:jc w:val="right"/>
+            </w:pPr>
+            <w:r>
+              <w:t>4</w:t>
+            </w:r>
+            <w:r>
+              <w:t xml:space="preserve"> </w:t>
+            </w:r>
+            <w:r>
+              <w:t>MiB</w:t>
+            </w:r>
+          </w:p>
+        </w:tc>
+        <w:tc>
+          <w:tcPr>
+            <w:tcW w:type="dxa" w:w="2025"/>
+            <w:vAlign w:val="center"/>
+          </w:tcPr>
+          <w:p>
+            <w:pPr>
+              <w:pStyle w:val="JTableText"/>
+              <w:keepNext/>
+              <w:keepLines/>
+              <w:ind w:firstLine="0"/>
+              <w:jc w:val="right"/>
+            </w:pPr>
+            <w:r>
+              <w:t>0.6948</w:t>
+            </w:r>
+          </w:p>
+        </w:tc>
+        <w:tc>
+          <w:tcPr>
+            <w:tcW w:type="dxa" w:w="3164"/>
+            <w:vAlign w:val="center"/>
+          </w:tcPr>
+          <w:p>
+            <w:pPr>
+              <w:pStyle w:val="JTableText"/>
+              <w:keepNext/>
+              <w:keepLines/>
+              <w:ind w:firstLine="0"/>
+              <w:jc w:val="right"/>
+            </w:pPr>
+            <w:r>
+              <w:t>0.7137</w:t>
+            </w:r>
+          </w:p>
+        </w:tc>
+      </w:tr>
+      <w:tr>
+        <w:trPr>
+          <w:cantSplit/>
+        </w:trPr>
+        <w:tc>
+          <w:tcPr>
+            <w:tcW w:type="dxa" w:w="1898"/>
+            <w:vAlign w:val="center"/>
+          </w:tcPr>
+          <w:p>
+            <w:pPr>
+              <w:pStyle w:val="JTableText"/>
+              <w:keepNext/>
+              <w:keepLines/>
+              <w:ind w:firstLine="0"/>
+              <w:jc w:val="right"/>
+            </w:pPr>
+            <w:r>
+              <w:t>16</w:t>
+            </w:r>
+            <w:r>
+              <w:t xml:space="preserve"> </w:t>
+            </w:r>
+            <w:r>
+              <w:t>MiB</w:t>
+            </w:r>
+          </w:p>
+        </w:tc>
+        <w:tc>
+          <w:tcPr>
+            <w:tcW w:type="dxa" w:w="2025"/>
+            <w:vAlign w:val="center"/>
+          </w:tcPr>
+          <w:p>
+            <w:pPr>
+              <w:pStyle w:val="JTableText"/>
+              <w:keepNext/>
+              <w:keepLines/>
+              <w:ind w:firstLine="0"/>
+              <w:jc w:val="right"/>
+            </w:pPr>
+            <w:r>
+              <w:t>0.8163</w:t>
+            </w:r>
+          </w:p>
+        </w:tc>
+        <w:tc>
+          <w:tcPr>
+            <w:tcW w:type="dxa" w:w="3164"/>
+            <w:vAlign w:val="center"/>
+          </w:tcPr>
+          <w:p>
+            <w:pPr>
+              <w:pStyle w:val="JTableText"/>
+              <w:keepNext/>
+              <w:keepLines/>
+              <w:ind w:firstLine="0"/>
+              <w:jc w:val="right"/>
+            </w:pPr>
+            <w:r>
+              <w:t>0.8240</w:t>
+            </w:r>
+          </w:p>
+        </w:tc>
+      </w:tr>
+      <w:tr>
+        <w:trPr>
+          <w:cantSplit/>
+        </w:trPr>
+        <w:tc>
+          <w:tcPr>
+            <w:tcW w:type="dxa" w:w="1898"/>
+            <w:vAlign w:val="center"/>
+          </w:tcPr>
+          <w:p>
+            <w:pPr>
+              <w:pStyle w:val="JTableText"/>
+              <w:keepNext w:val="0"/>
+              <w:keepLines/>
+              <w:ind w:firstLine="0"/>
+              <w:jc w:val="right"/>
+            </w:pPr>
+            <w:r>
+              <w:t>32</w:t>
+            </w:r>
+            <w:r>
+              <w:t xml:space="preserve"> </w:t>
+            </w:r>
+            <w:r>
+              <w:t>MiB</w:t>
+            </w:r>
+          </w:p>
+        </w:tc>
+        <w:tc>
+          <w:tcPr>
+            <w:tcW w:type="dxa" w:w="2025"/>
+            <w:vAlign w:val="center"/>
+          </w:tcPr>
+          <w:p>
+            <w:pPr>
+              <w:pStyle w:val="JTableText"/>
+              <w:keepNext w:val="0"/>
+              <w:keepLines/>
+              <w:ind w:firstLine="0"/>
+              <w:jc w:val="right"/>
+            </w:pPr>
+            <w:r>
+              <w:t>0.8963</w:t>
+            </w:r>
+          </w:p>
+        </w:tc>
+        <w:tc>
+          <w:tcPr>
+            <w:tcW w:type="dxa" w:w="3164"/>
+            <w:vAlign w:val="center"/>
+          </w:tcPr>
+          <w:p>
+            <w:pPr>
+              <w:pStyle w:val="JTableText"/>
+              <w:keepNext w:val="0"/>
+              <w:keepLines/>
+              <w:ind w:firstLine="0"/>
+              <w:jc w:val="right"/>
+            </w:pPr>
+            <w:r>
+              <w:t>0.9125</w:t>
+            </w:r>
+          </w:p>
+        </w:tc>
+      </w:tr>
+    </w:tbl>
+    <w:p>
+      <w:pPr>
+        <w:pStyle w:val="JText"/>
+        <w:spacing w:line="240" w:lineRule="auto"/>
+      </w:pPr>
+      <w:r>
+        <w:t>The most informative case is a batch of 32 independent pages. The median CPU native transform duration is approximately 8.362</w:t>
+      </w:r>
+      <w:r>
+        <w:t xml:space="preserve"> </w:t>
+      </w:r>
+      <w:r>
+        <w:t>ms, compared with 3.714</w:t>
+      </w:r>
+      <w:r>
+        <w:t xml:space="preserve"> </w:t>
+      </w:r>
+      <w:r>
+        <w:t>ms for one GPU-resident kernel and 9.153</w:t>
+      </w:r>
+      <w:r>
+        <w:t xml:space="preserve"> </w:t>
+      </w:r>
+      <w:r>
+        <w:t xml:space="preserve">ms for the prepared GPU pipeline. </w:t>
+      </w:r>
+      <w:r>
+        <w:rPr>
+          <w:b/>
+        </w:rPr>
+        <w:t>Table</w:t>
+      </w:r>
+      <w:r>
+        <w:rPr>
+          <w:b/>
+        </w:rPr>
+        <w:t xml:space="preserve"> </w:t>
+      </w:r>
+      <w:r>
+        <w:rPr>
+          <w:b/>
+        </w:rPr>
+        <w:t>6</w:t>
+      </w:r>
+      <w:r>
+        <w:t xml:space="preserve"> separates the measurements. The compute-only ratio is </w:t>
+      </w:r>
+      <m:oMath>
+        <m:box>
+          <m:e>
+            <m:r>
+              <m:rPr>
+                <m:sty m:val="p"/>
+              </m:rPr>
+              <w:rPr>
+                <w:sz w:val="22"/>
+              </w:rPr>
+              <m:t>2.251</m:t>
+            </m:r>
+            <m:r>
+              <m:rPr>
+                <m:sty m:val="p"/>
+              </m:rPr>
+              <w:rPr>
+                <w:sz w:val="22"/>
+              </w:rPr>
+              <m:t>×</m:t>
+            </m:r>
+          </m:e>
+        </m:box>
+      </m:oMath>
+      <w:r>
+        <w:t xml:space="preserve"> in favor of the GPU, whereas the transfer-inclusive ratio is </w:t>
+      </w:r>
+      <m:oMath>
+        <m:box>
+          <m:e>
+            <m:r>
+              <m:rPr>
+                <m:sty m:val="p"/>
+              </m:rPr>
+              <w:rPr>
+                <w:sz w:val="22"/>
+              </w:rPr>
+              <m:t>0.913</m:t>
+            </m:r>
+            <m:r>
+              <m:rPr>
+                <m:sty m:val="p"/>
+              </m:rPr>
+              <w:rPr>
+                <w:sz w:val="22"/>
+              </w:rPr>
+              <m:t>×</m:t>
+            </m:r>
+          </m:e>
+        </m:box>
+      </m:oMath>
+      <w:r>
+        <w:t xml:space="preserve"> and favors the CPU. Both directions are consistent across all five sessions. The observed H2D-plus-D2H component is about 5.418</w:t>
+      </w:r>
+      <w:r>
+        <w:t xml:space="preserve"> </w:t>
+      </w:r>
+      <w:r>
+        <w:t>ms. Medians of nested or separately timed components cannot be added as if they described a single observation.</w:t>
+      </w:r>
+    </w:p>
+    <w:p>
+      <w:pPr>
+        <w:pStyle w:val="JFigure"/>
+        <w:keepNext/>
+      </w:pPr>
+      <w:r>
+        <w:rPr>
+          <w:b/>
+        </w:rPr>
+        <w:t>Table 6</w:t>
+      </w:r>
+      <w:r>
+        <w:br/>
+      </w:r>
+      <w:r>
+        <w:rPr>
+          <w:i/>
+        </w:rPr>
+        <w:t>Tesla T4 Phase 2, 32 independent 1</w:t>
+      </w:r>
+      <w:r>
+        <w:rPr>
+          <w:i/>
+        </w:rPr>
+        <w:t xml:space="preserve"> </w:t>
+      </w:r>
+      <w:r>
+        <w:rPr>
+          <w:i/>
+        </w:rPr>
+        <w:t>MiB pages: separately summarized timings (five session medians).</w:t>
+      </w:r>
+    </w:p>
+    <w:tbl>
+      <w:tblPr>
+        <w:tblW w:w="7088" w:type="dxa"/>
+        <w:jc w:val="center"/>
+        <w:tblBorders>
+          <w:top w:val="single" w:sz="6" w:space="0" w:color="auto"/>
+          <w:left w:val="single" w:sz="6" w:space="0" w:color="auto"/>
+          <w:bottom w:val="single" w:sz="6" w:space="0" w:color="auto"/>
+          <w:right w:val="single" w:sz="6" w:space="0" w:color="auto"/>
+          <w:insideH w:val="single" w:sz="4" w:space="0" w:color="auto"/>
+          <w:insideV w:val="single" w:sz="4" w:space="0" w:color="auto"/>
+        </w:tblBorders>
+        <w:tblLayout w:type="fixed"/>
+        <w:tblLook w:val="01E0" w:firstRow="1" w:lastRow="1" w:firstColumn="1" w:lastColumn="1" w:noHBand="0" w:noVBand="0"/>
+      </w:tblPr>
+      <w:tblGrid>
+        <w:gridCol w:w="3691"/>
+        <w:gridCol w:w="3396"/>
+      </w:tblGrid>
+      <w:tr>
+        <w:trPr>
+          <w:cantSplit/>
+          <w:tblHeader/>
+        </w:trPr>
+        <w:tc>
+          <w:tcPr>
+            <w:tcW w:type="dxa" w:w="3691"/>
+            <w:vAlign w:val="center"/>
+          </w:tcPr>
+          <w:p>
+            <w:pPr>
+              <w:pStyle w:val="JTableText"/>
+              <w:keepNext/>
+              <w:keepLines/>
+              <w:ind w:firstLine="0"/>
+              <w:jc w:val="left"/>
+            </w:pPr>
+            <w:r>
+              <w:t>Measurement boundary</w:t>
+            </w:r>
+          </w:p>
+        </w:tc>
+        <w:tc>
+          <w:tcPr>
+            <w:tcW w:type="dxa" w:w="3396"/>
+            <w:vAlign w:val="center"/>
+          </w:tcPr>
+          <w:p>
+            <w:pPr>
+              <w:pStyle w:val="JTableText"/>
+              <w:keepNext/>
+              <w:keepLines/>
+              <w:ind w:firstLine="0"/>
+              <w:jc w:val="right"/>
+            </w:pPr>
+            <w:r>
+              <w:t>Approximate time (ms)</w:t>
+            </w:r>
+          </w:p>
+        </w:tc>
+      </w:tr>
+      <w:tr>
+        <w:trPr>
+          <w:cantSplit/>
+        </w:trPr>
+        <w:tc>
+          <w:tcPr>
+            <w:tcW w:type="dxa" w:w="3691"/>
+            <w:vAlign w:val="center"/>
+          </w:tcPr>
+          <w:p>
+            <w:pPr>
+              <w:pStyle w:val="JTableText"/>
+              <w:keepNext/>
+              <w:keepLines/>
+              <w:ind w:firstLine="0"/>
+              <w:jc w:val="left"/>
+            </w:pPr>
+            <w:r>
+              <w:t>Native OpenSSL CPU transform</w:t>
+            </w:r>
+          </w:p>
+        </w:tc>
+        <w:tc>
+          <w:tcPr>
+            <w:tcW w:type="dxa" w:w="3396"/>
+            <w:vAlign w:val="center"/>
+          </w:tcPr>
+          <w:p>
+            <w:pPr>
+              <w:pStyle w:val="JTableText"/>
+              <w:keepNext/>
+              <w:keepLines/>
+              <w:ind w:firstLine="0"/>
+              <w:jc w:val="right"/>
+            </w:pPr>
+            <w:r>
+              <w:t>8.362</w:t>
+            </w:r>
+          </w:p>
+        </w:tc>
+      </w:tr>
+      <w:tr>
+        <w:trPr>
+          <w:cantSplit/>
+        </w:trPr>
+        <w:tc>
+          <w:tcPr>
+            <w:tcW w:type="dxa" w:w="3691"/>
+            <w:vAlign w:val="center"/>
+          </w:tcPr>
+          <w:p>
+            <w:pPr>
+              <w:pStyle w:val="JTableText"/>
+              <w:keepNext/>
+              <w:keepLines/>
+              <w:ind w:firstLine="0"/>
+              <w:jc w:val="left"/>
+            </w:pPr>
+            <w:r>
+              <w:t>CUDA resident kernel</w:t>
+            </w:r>
+          </w:p>
+        </w:tc>
+        <w:tc>
+          <w:tcPr>
+            <w:tcW w:type="dxa" w:w="3396"/>
+            <w:vAlign w:val="center"/>
+          </w:tcPr>
+          <w:p>
+            <w:pPr>
+              <w:pStyle w:val="JTableText"/>
+              <w:keepNext/>
+              <w:keepLines/>
+              <w:ind w:firstLine="0"/>
+              <w:jc w:val="right"/>
+            </w:pPr>
+            <w:r>
+              <w:t>3.714</w:t>
+            </w:r>
+          </w:p>
+        </w:tc>
+      </w:tr>
+      <w:tr>
+        <w:trPr>
+          <w:cantSplit/>
+        </w:trPr>
+        <w:tc>
+          <w:tcPr>
+            <w:tcW w:type="dxa" w:w="3691"/>
+            <w:vAlign w:val="center"/>
+          </w:tcPr>
+          <w:p>
+            <w:pPr>
+              <w:pStyle w:val="JTableText"/>
+              <w:keepNext/>
+              <w:keepLines/>
+              <w:ind w:firstLine="0"/>
+              <w:jc w:val="left"/>
+            </w:pPr>
+            <w:r>
+              <w:t>GPU H2D + D2H transfers</w:t>
+            </w:r>
+          </w:p>
+        </w:tc>
+        <w:tc>
+          <w:tcPr>
+            <w:tcW w:type="dxa" w:w="3396"/>
+            <w:vAlign w:val="center"/>
+          </w:tcPr>
+          <w:p>
+            <w:pPr>
+              <w:pStyle w:val="JTableText"/>
+              <w:keepNext/>
+              <w:keepLines/>
+              <w:ind w:firstLine="0"/>
+              <w:jc w:val="right"/>
+            </w:pPr>
+            <w:r>
+              <w:t>5.418</w:t>
+            </w:r>
+          </w:p>
+        </w:tc>
+      </w:tr>
+      <w:tr>
+        <w:trPr>
+          <w:cantSplit/>
+        </w:trPr>
+        <w:tc>
+          <w:tcPr>
+            <w:tcW w:type="dxa" w:w="3691"/>
+            <w:vAlign w:val="center"/>
+          </w:tcPr>
+          <w:p>
+            <w:pPr>
+              <w:pStyle w:val="JTableText"/>
+              <w:keepNext/>
+              <w:keepLines/>
+              <w:ind w:firstLine="0"/>
+              <w:jc w:val="left"/>
+            </w:pPr>
+            <w:r>
+              <w:t>CUDA prepared pipeline, including transfers and synchronization</w:t>
+            </w:r>
+          </w:p>
+        </w:tc>
+        <w:tc>
+          <w:tcPr>
+            <w:tcW w:type="dxa" w:w="3396"/>
+            <w:vAlign w:val="center"/>
+          </w:tcPr>
+          <w:p>
+            <w:pPr>
+              <w:pStyle w:val="JTableText"/>
+              <w:keepNext/>
+              <w:keepLines/>
+              <w:ind w:firstLine="0"/>
+              <w:jc w:val="right"/>
+            </w:pPr>
+            <w:r>
+              <w:t>9.153</w:t>
+            </w:r>
+          </w:p>
+        </w:tc>
+      </w:tr>
+      <w:tr>
+        <w:trPr>
+          <w:cantSplit/>
+        </w:trPr>
+        <w:tc>
+          <w:tcPr>
+            <w:tcW w:type="dxa" w:w="3691"/>
+            <w:vAlign w:val="center"/>
+          </w:tcPr>
+          <w:p>
+            <w:pPr>
+              <w:pStyle w:val="JTableText"/>
+              <w:keepNext/>
+              <w:keepLines/>
+              <w:ind w:firstLine="0"/>
+              <w:jc w:val="left"/>
+            </w:pPr>
+            <w:r>
+              <w:t>GPU compute-only speedup versus CPU transform</w:t>
+            </w:r>
+          </w:p>
+        </w:tc>
+        <w:tc>
+          <w:tcPr>
+            <w:tcW w:type="dxa" w:w="3396"/>
+            <w:vAlign w:val="center"/>
+          </w:tcPr>
+          <w:p>
+            <w:pPr>
+              <w:pStyle w:val="JTableText"/>
+              <w:keepNext/>
+              <w:keepLines/>
+              <w:ind w:firstLine="0"/>
+              <w:jc w:val="right"/>
+            </w:pPr>
+            <m:oMath>
+              <m:box>
+                <m:e>
+                  <m:r>
+                    <m:rPr>
+                      <m:sty m:val="p"/>
+                    </m:rPr>
+                    <w:rPr>
+                      <w:sz w:val="22"/>
+                    </w:rPr>
+                    <m:t>2.251</m:t>
+                  </m:r>
+                  <m:r>
+                    <m:rPr>
+                      <m:sty m:val="p"/>
+                    </m:rPr>
+                    <w:rPr>
+                      <w:sz w:val="22"/>
+                    </w:rPr>
+                    <m:t>×</m:t>
+                  </m:r>
+                </m:e>
+              </m:box>
+            </m:oMath>
+          </w:p>
+        </w:tc>
+      </w:tr>
+      <w:tr>
+        <w:trPr>
+          <w:cantSplit/>
+        </w:trPr>
+        <w:tc>
+          <w:tcPr>
+            <w:tcW w:type="dxa" w:w="3691"/>
+            <w:vAlign w:val="center"/>
+          </w:tcPr>
+          <w:p>
+            <w:pPr>
+              <w:pStyle w:val="JTableText"/>
+              <w:keepNext w:val="0"/>
+              <w:keepLines/>
+              <w:ind w:firstLine="0"/>
+              <w:jc w:val="left"/>
+            </w:pPr>
+            <w:r>
+              <w:t>GPU prepared-pipeline speedup versus CPU transform</w:t>
+            </w:r>
+          </w:p>
+        </w:tc>
+        <w:tc>
+          <w:tcPr>
+            <w:tcW w:type="dxa" w:w="3396"/>
+            <w:vAlign w:val="center"/>
+          </w:tcPr>
+          <w:p>
+            <w:pPr>
+              <w:pStyle w:val="JTableText"/>
+              <w:keepNext w:val="0"/>
+              <w:keepLines/>
+              <w:ind w:firstLine="0"/>
+              <w:jc w:val="right"/>
+            </w:pPr>
+            <m:oMath>
+              <m:box>
+                <m:e>
+                  <m:r>
+                    <m:rPr>
+                      <m:sty m:val="p"/>
+                    </m:rPr>
+                    <w:rPr>
+                      <w:sz w:val="22"/>
+                    </w:rPr>
+                    <m:t>0.913</m:t>
+                  </m:r>
+                  <m:r>
+                    <m:rPr>
+                      <m:sty m:val="p"/>
+                    </m:rPr>
+                    <w:rPr>
+                      <w:sz w:val="22"/>
+                    </w:rPr>
+                    <m:t>×</m:t>
+                  </m:r>
+                </m:e>
+              </m:box>
+            </m:oMath>
+          </w:p>
+        </w:tc>
+      </w:tr>
+    </w:tbl>
+    <w:p>
+      <w:pPr>
+        <w:pStyle w:val="JText"/>
+        <w:spacing w:line="240" w:lineRule="auto"/>
+      </w:pPr>
+      <w:r>
+        <w:t xml:space="preserve">The page-aware GPU prepared pipeline shows almost no relative penalty against a single continuous CTR stream of the same size: its page/continuous throughput ratios are approximately </w:t>
+      </w:r>
+      <m:oMath>
+        <m:box>
+          <m:e>
+            <m:r>
+              <m:rPr>
+                <m:sty m:val="p"/>
+              </m:rPr>
+              <w:rPr>
+                <w:sz w:val="22"/>
+              </w:rPr>
+              <m:t>1.0007</m:t>
+            </m:r>
+            <m:r>
+              <m:rPr>
+                <m:sty m:val="p"/>
+              </m:rPr>
+              <w:rPr>
+                <w:sz w:val="22"/>
+              </w:rPr>
+              <m:t>×</m:t>
+            </m:r>
+          </m:e>
+        </m:box>
+      </m:oMath>
+      <w:r>
+        <w:t xml:space="preserve"> at 4</w:t>
+      </w:r>
+      <w:r>
+        <w:t xml:space="preserve"> </w:t>
+      </w:r>
+      <w:r>
+        <w:t xml:space="preserve">MiB, </w:t>
+      </w:r>
+      <m:oMath>
+        <m:box>
+          <m:e>
+            <m:r>
+              <m:rPr>
+                <m:sty m:val="p"/>
+              </m:rPr>
+              <w:rPr>
+                <w:sz w:val="22"/>
+              </w:rPr>
+              <m:t>1.0068</m:t>
+            </m:r>
+            <m:r>
+              <m:rPr>
+                <m:sty m:val="p"/>
+              </m:rPr>
+              <w:rPr>
+                <w:sz w:val="22"/>
+              </w:rPr>
+              <m:t>×</m:t>
+            </m:r>
+          </m:e>
+        </m:box>
+      </m:oMath>
+      <w:r>
+        <w:t xml:space="preserve"> at 16</w:t>
+      </w:r>
+      <w:r>
+        <w:t xml:space="preserve"> </w:t>
+      </w:r>
+      <w:r>
+        <w:t xml:space="preserve">MiB and </w:t>
+      </w:r>
+      <m:oMath>
+        <m:box>
+          <m:e>
+            <m:r>
+              <m:rPr>
+                <m:sty m:val="p"/>
+              </m:rPr>
+              <w:rPr>
+                <w:sz w:val="22"/>
+              </w:rPr>
+              <m:t>1.0066</m:t>
+            </m:r>
+            <m:r>
+              <m:rPr>
+                <m:sty m:val="p"/>
+              </m:rPr>
+              <w:rPr>
+                <w:sz w:val="22"/>
+              </w:rPr>
+              <m:t>×</m:t>
+            </m:r>
+          </m:e>
+        </m:box>
+      </m:oMath>
+      <w:r>
+        <w:t xml:space="preserve"> at 32</w:t>
+      </w:r>
+      <w:r>
+        <w:t xml:space="preserve"> </w:t>
+      </w:r>
+      <w:r>
+        <w:t>MiB. These sub-percent differences should not be described as a robust optimization gain. They support the narrower observation that independent per-page counter handling does not impose a large measured GPU pipeline overhead in the evaluated implementation. This is distinct from demonstrating an advantage from batching over sequential per-page GPU launches, which was not the control experiment.</w:t>
+      </w:r>
+    </w:p>
+    <w:p>
+      <w:pPr>
+        <w:pStyle w:val="JSubtitle"/>
+      </w:pPr>
+      <w:r>
+        <w:t>5</w:t>
+        <w:tab/>
+      </w:r>
+      <w:r>
+        <w:t>Discussion</w:t>
+      </w:r>
+    </w:p>
+    <w:p>
+      <w:pPr>
+        <w:pStyle w:val="JSubSubTitle"/>
+      </w:pPr>
+      <w:r>
+        <w:t>5.1</w:t>
+        <w:tab/>
+      </w:r>
+      <w:r>
+        <w:t>The specific favorable case: data already on the GPU</w:t>
+      </w:r>
+    </w:p>
+    <w:p>
+      <w:pPr>
+        <w:pStyle w:val="JText"/>
+        <w:spacing w:line="240" w:lineRule="auto"/>
+      </w:pPr>
+      <w:r>
+        <w:t>The positive result is precise: for 32 independently encrypted 1</w:t>
+      </w:r>
+      <w:r>
+        <w:t xml:space="preserve"> </w:t>
+      </w:r>
+      <w:r>
+        <w:t>MiB pages, one CUDA resident AES-128-CTR launch takes approximately 3.714</w:t>
+      </w:r>
+      <w:r>
+        <w:t xml:space="preserve"> </w:t>
+      </w:r>
+      <w:r>
+        <w:t>ms, whereas native OpenSSL EVP requires approximately 8.362</w:t>
+      </w:r>
+      <w:r>
+        <w:t xml:space="preserve"> </w:t>
+      </w:r>
+      <w:r>
+        <w:t xml:space="preserve">ms for the prepared sequential CPU transformation. The measured </w:t>
+      </w:r>
+      <m:oMath>
+        <m:box>
+          <m:e>
+            <m:r>
+              <m:rPr>
+                <m:sty m:val="p"/>
+              </m:rPr>
+              <w:rPr>
+                <w:sz w:val="22"/>
+              </w:rPr>
+              <m:t>2.251</m:t>
+            </m:r>
+            <m:r>
+              <m:rPr>
+                <m:sty m:val="p"/>
+              </m:rPr>
+              <w:rPr>
+                <w:sz w:val="22"/>
+              </w:rPr>
+              <m:t>×</m:t>
+            </m:r>
+          </m:e>
+        </m:box>
+      </m:oMath>
+      <w:r>
+        <w:t xml:space="preserve"> ratio makes GPU execution a credible compute-stage candidate when plaintext is already GPU-resident and the encrypted result is needed on the device for another processing stage. This is not a claim that an ordinary host-memory encryption service becomes </w:t>
+      </w:r>
+      <m:oMath>
+        <m:box>
+          <m:e>
+            <m:r>
+              <m:rPr>
+                <m:sty m:val="p"/>
+              </m:rPr>
+              <w:rPr>
+                <w:sz w:val="22"/>
+              </w:rPr>
+              <m:t>2.251</m:t>
+            </m:r>
+            <m:r>
+              <m:rPr>
+                <m:sty m:val="p"/>
+              </m:rPr>
+              <w:rPr>
+                <w:sz w:val="22"/>
+              </w:rPr>
+              <m:t>×</m:t>
+            </m:r>
+          </m:e>
+        </m:box>
+      </m:oMath>
+      <w:r>
+        <w:t xml:space="preserve"> faster: the resident interval excludes data placement, GPU allocation and preparation, and a complete multi-stage application has not been benchmarked.</w:t>
+      </w:r>
+    </w:p>
+    <w:p>
+      <w:pPr>
+        <w:pStyle w:val="JText"/>
+        <w:spacing w:line="240" w:lineRule="auto"/>
+      </w:pPr>
+      <w:r>
+        <w:t xml:space="preserve">Potential workload classes include GPU-native analytics pipelines, pipelines that prepare columnar buffers on the GPU before encryption, and device-side processing that passes the resulting ciphertext to a later GPU operation. The common factor is </w:t>
+      </w:r>
+      <w:r>
+        <w:rPr>
+          <w:i/>
+        </w:rPr>
+        <w:t>avoided payload round trips</w:t>
+      </w:r>
+      <w:r>
+        <w:t>, not the mere presence of a GPU. Such placement can be attractive only if input data originate on the device or would need to move to it for other work anyway, and if the required output does not have to return immediately to the CPU. Where plaintext starts in host RAM and ciphertext is consumed by a host process, the tested prepared pipeline takes approximately 9.153</w:t>
+      </w:r>
+      <w:r>
+        <w:t xml:space="preserve"> </w:t>
+      </w:r>
+      <w:r>
+        <w:t>ms versus 8.362</w:t>
+      </w:r>
+      <w:r>
+        <w:t xml:space="preserve"> </w:t>
+      </w:r>
+      <w:r>
+        <w:t>ms for CPU transformation: the CPU is faster at these declared boundaries.</w:t>
+      </w:r>
+    </w:p>
+    <w:p>
+      <w:pPr>
+        <w:pStyle w:val="JSubSubTitle"/>
+      </w:pPr>
+      <w:r>
+        <w:t>5.2</w:t>
+        <w:tab/>
+      </w:r>
+      <w:r>
+        <w:t>A measured data-movement budget, not an application speedup</w:t>
+      </w:r>
+    </w:p>
+    <w:p>
+      <w:pPr>
+        <w:pStyle w:val="JText"/>
+        <w:spacing w:line="240" w:lineRule="auto"/>
+      </w:pPr>
+      <w:r>
+        <w:t>The 32</w:t>
+      </w:r>
+      <w:r>
+        <w:t xml:space="preserve"> </w:t>
+      </w:r>
+      <w:r>
+        <w:t>MiB prepared GPU pipeline is approximately 0.791</w:t>
+      </w:r>
+      <w:r>
+        <w:t xml:space="preserve"> </w:t>
+      </w:r>
+      <w:r>
+        <w:t>ms slower than the prepared CPU transformation, based on the displayed session-level median durations. This difference describes the margin to parity for the measured configuration, not an empirically achieved optimization. The approximately 5.418</w:t>
+      </w:r>
+      <w:r>
+        <w:t xml:space="preserve"> </w:t>
+      </w:r>
+      <w:r>
+        <w:t>ms transfer component demonstrates that data movement is large relative to AES kernel execution; its separately reported median is not directly substitutable into a single-iteration latency equation. Avoiding transfers could make GPU-resident processing competitive, but the exact crossover requires a new workload-level experiment including data preparation, input residency, output placement, any subsequent consumer, and buffer lifetime.</w:t>
+      </w:r>
+    </w:p>
+    <w:p>
+      <w:pPr>
+        <w:pStyle w:val="JText"/>
+        <w:spacing w:line="240" w:lineRule="auto"/>
+      </w:pPr>
+      <w:r>
+        <w:t>The ratio of CPU operation-envelope to GPU prepared-pipeline time is not a symmetrical end-to-end comparison: CPU allocation and setup are included, whereas GPU allocation, key upload, pinned-memory staging and final conversion are excluded. It must not be used to claim an application-level speedup. A second caution is that native OpenSSL EVP timings exclude the Python wrapper, unlike parts of the GPU path. The present study therefore provides a well-defined prepared-workload comparison rather than a common application API benchmark.</w:t>
+      </w:r>
+    </w:p>
+    <w:p>
+      <w:pPr>
+        <w:pStyle w:val="JSubSubTitle"/>
+      </w:pPr>
+      <w:r>
+        <w:t>5.3</w:t>
+        <w:tab/>
+      </w:r>
+      <w:r>
+        <w:t>Independent pages and practical storage workloads</w:t>
+      </w:r>
+    </w:p>
+    <w:p>
+      <w:pPr>
+        <w:pStyle w:val="JText"/>
+        <w:spacing w:line="240" w:lineRule="auto"/>
+      </w:pPr>
+      <w:r>
+        <w:t>Correct independent CTR processing is more than slicing a continuous stream: each logical page needs its own nonce/counter domain, and the counter must not cross the domain boundary. The page-aware CUDA implementation verifies these conditions and processes a batch in one launch. At 32</w:t>
+      </w:r>
+      <w:r>
+        <w:t xml:space="preserve"> </w:t>
+      </w:r>
+      <w:r>
+        <w:t>MiB, the measured GPU pipeline throughput differs by less than 1</w:t>
+      </w:r>
+      <w:r>
+        <w:t>%</w:t>
+      </w:r>
+      <w:r>
+        <w:t xml:space="preserve"> from the continuous control; hence handling page boundaries does not impose a large penalty in this specific kernel. The observation does not imply that page batching is faster than separately launching the pages: no separate-per-page launch baseline was included, and the CPU processes the pages sequentially.</w:t>
+      </w:r>
+    </w:p>
+    <w:p>
+      <w:pPr>
+        <w:pStyle w:val="JText"/>
+        <w:spacing w:line="240" w:lineRule="auto"/>
+      </w:pPr>
+      <w:r>
+        <w:t xml:space="preserve">The Parquet </w:t>
+      </w:r>
+      <w:r>
+        <w:rPr>
+          <w:rFonts w:ascii="Courier New" w:hAnsi="Courier New"/>
+        </w:rPr>
+        <w:t>AES</w:t>
+      </w:r>
+      <w:r>
+        <w:rPr>
+          <w:rFonts w:ascii="Courier New" w:hAnsi="Courier New"/>
+        </w:rPr>
+        <w:t>_</w:t>
+      </w:r>
+      <w:r>
+        <w:rPr>
+          <w:rFonts w:ascii="Courier New" w:hAnsi="Courier New"/>
+        </w:rPr>
+        <w:t>GCM</w:t>
+      </w:r>
+      <w:r>
+        <w:rPr>
+          <w:rFonts w:ascii="Courier New" w:hAnsi="Courier New"/>
+        </w:rPr>
+        <w:t>_</w:t>
+      </w:r>
+      <w:r>
+        <w:rPr>
+          <w:rFonts w:ascii="Courier New" w:hAnsi="Courier New"/>
+        </w:rPr>
+        <w:t>CTR</w:t>
+      </w:r>
+      <w:r>
+        <w:rPr>
+          <w:rFonts w:ascii="Courier New" w:hAnsi="Courier New"/>
+        </w:rPr>
+        <w:t>_</w:t>
+      </w:r>
+      <w:r>
+        <w:rPr>
+          <w:rFonts w:ascii="Courier New" w:hAnsi="Courier New"/>
+        </w:rPr>
+        <w:t>V1</w:t>
+      </w:r>
+      <w:r>
+        <w:t xml:space="preserve"> design</w:t>
+      </w:r>
+      <w:r>
+        <w:t xml:space="preserve"> </w:t>
+      </w:r>
+      <w:r>
+        <w:t>[23]</w:t>
+      </w:r>
+      <w:r>
+        <w:t xml:space="preserve"> motivates the page geometry, but the experiment is not a Parquet writer, reader or encryptor. Format metadata, AAD, authentication, key management, compression and nonce-generation rules remain absent. Raw CTR encryption is malleable and provides no integrity protection. Practical storage deployment therefore requires a complete format-compliant and authenticated workflow; AES-CTR throughput alone cannot support security or end-to-end speedup claims about such a system.</w:t>
+      </w:r>
+    </w:p>
+    <w:p>
+      <w:pPr>
+        <w:pStyle w:val="JSubSubTitle"/>
+      </w:pPr>
+      <w:r>
+        <w:t>5.4</w:t>
+        <w:tab/>
+      </w:r>
+      <w:r>
+        <w:t>Why the CPU baseline matters</w:t>
+      </w:r>
+    </w:p>
+    <w:p>
+      <w:pPr>
+        <w:pStyle w:val="JText"/>
+        <w:spacing w:line="240" w:lineRule="auto"/>
+      </w:pPr>
+      <w:r>
+        <w:t xml:space="preserve">The historical </w:t>
+      </w:r>
+      <m:oMath>
+        <m:box>
+          <m:e>
+            <m:r>
+              <m:rPr>
+                <m:sty m:val="p"/>
+              </m:rPr>
+              <w:rPr>
+                <w:sz w:val="22"/>
+              </w:rPr>
+              <m:t>4.761</m:t>
+            </m:r>
+            <m:r>
+              <m:rPr>
+                <m:sty m:val="p"/>
+              </m:rPr>
+              <w:rPr>
+                <w:sz w:val="22"/>
+              </w:rPr>
+              <m:t>×</m:t>
+            </m:r>
+          </m:e>
+        </m:box>
+      </m:oMath>
+      <w:r>
+        <w:t xml:space="preserve"> T4 result used a PyCryptodome-based host interval. The fresh T4 campaign measured </w:t>
+      </w:r>
+      <m:oMath>
+        <m:box>
+          <m:e>
+            <m:r>
+              <m:rPr>
+                <m:sty m:val="p"/>
+              </m:rPr>
+              <w:rPr>
+                <w:sz w:val="22"/>
+              </w:rPr>
+              <m:t>5.586</m:t>
+            </m:r>
+            <m:r>
+              <m:rPr>
+                <m:sty m:val="p"/>
+              </m:rPr>
+              <w:rPr>
+                <w:sz w:val="22"/>
+              </w:rPr>
+              <m:t>×</m:t>
+            </m:r>
+          </m:e>
+        </m:box>
+      </m:oMath>
+      <w:r>
+        <w:t xml:space="preserve"> against PyCryptodome but only </w:t>
+      </w:r>
+      <m:oMath>
+        <m:box>
+          <m:e>
+            <m:r>
+              <m:rPr>
+                <m:sty m:val="p"/>
+              </m:rPr>
+              <w:rPr>
+                <w:sz w:val="22"/>
+              </w:rPr>
+              <m:t>0.942</m:t>
+            </m:r>
+            <m:r>
+              <m:rPr>
+                <m:sty m:val="p"/>
+              </m:rPr>
+              <w:rPr>
+                <w:sz w:val="22"/>
+              </w:rPr>
+              <m:t>×</m:t>
+            </m:r>
+          </m:e>
+        </m:box>
+      </m:oMath>
+      <w:r>
+        <w:t xml:space="preserve"> against native OpenSSL at the prepared GPU boundary. The native implementation makes the CPU substantially more competitive. Because library versions, API overhead and timing boundaries differ, this is evidence of baseline sensitivity rather than a proof that the old measurement was invalid. Historical GTX 1650 Ti and T600 findings remain useful for showing diversity across complete configurations but cannot substitute for a same-runtime OpenSSL-controlled study on those machines.</w:t>
+      </w:r>
+    </w:p>
+    <w:p>
+      <w:pPr>
+        <w:pStyle w:val="JSubSubTitle"/>
+      </w:pPr>
+      <w:r>
+        <w:t>5.5</w:t>
+        <w:tab/>
+      </w:r>
+      <w:r>
+        <w:t>Generalizability, constraints and future work</w:t>
+      </w:r>
+    </w:p>
+    <w:p>
+      <w:pPr>
+        <w:pStyle w:val="JText"/>
+        <w:spacing w:line="240" w:lineRule="auto"/>
+      </w:pPr>
+      <w:r>
+        <w:t>The relevant engineering decision is whether a specific pipeline can retain plaintext and ciphertext on the GPU while maintaining its functional and security requirements. The following hypotheses are actionable but untested: (1) a GPU-first columnar transformation followed by resident encryption could avoid round-trip payload transfers; (2) encryption before another GPU-resident consumer could make cipher output placement beneficial; and (3) pipelined transfers or batch reuse might reduce the effective movement cost for host-resident data. None is demonstrated by the present one-launch benchmarks.</w:t>
+      </w:r>
+    </w:p>
+    <w:p>
+      <w:pPr>
+        <w:pStyle w:val="JText"/>
+        <w:spacing w:line="240" w:lineRule="auto"/>
+      </w:pPr>
+      <w:r>
+        <w:t>The next experiment should implement an actual producer</w:t>
+      </w:r>
+      <w:r>
+        <w:t>–</w:t>
+      </w:r>
+      <w:r>
+        <w:t>encrypt</w:t>
+      </w:r>
+      <w:r>
+        <w:t>–</w:t>
+      </w:r>
+      <w:r>
+        <w:t xml:space="preserve">consumer CUDA pipeline, with device-resident buffers, an explicit encrypted-output consumer, correctness validation, and a CPU counterpart completing the same functional work. It should account for input acquisition, context/key and nonce-table setup, GPU allocation, transfers actually needed, synchronization and output disposition. A separate one-page-at-a-time GPU launch baseline would isolate the genuine </w:t>
+      </w:r>
+      <w:r>
+        <w:rPr>
+          <w:i/>
+        </w:rPr>
+        <w:t>batching</w:t>
+      </w:r>
+      <w:r>
+        <w:t xml:space="preserve"> effect from the present continuous CTR control. Format-level work would integrate Parquet's full encryption rules, authenticated metadata, and key management, then report file or query throughput and latency. AES-GCM, AES-256, overlapping streams and multiple simultaneous requests are further experiments, not consequences of AES-128-CTR results.</w:t>
+      </w:r>
+    </w:p>
+    <w:p>
+      <w:pPr>
+        <w:pStyle w:val="JText"/>
+        <w:spacing w:line="240" w:lineRule="auto"/>
+      </w:pPr>
+      <w:r>
+        <w:t>The present measurements use one CUDA implementation and a single-threaded native CPU comparator, five sessions, synthetic data and a shared cloud platform. Kernel-level and transfer timings use different instrumentation; GPU scheduling, memory placement, host contention and CPU dispatch affect results. No instruction-level trace was captured. The work neither ranks all available CPUs/GPUs nor estimates a universal cross-platform crossover.</w:t>
+      </w:r>
+    </w:p>
+    <w:p>
+      <w:pPr>
+        <w:pStyle w:val="JSubtitle"/>
+      </w:pPr>
+      <w:r>
+        <w:t>6</w:t>
+        <w:tab/>
+      </w:r>
+      <w:r>
+        <w:t>Conclusion</w:t>
+      </w:r>
+    </w:p>
+    <w:p>
+      <w:pPr>
+        <w:pStyle w:val="JText"/>
+        <w:spacing w:line="240" w:lineRule="auto"/>
+      </w:pPr>
+      <w:r>
+        <w:t>The experiments identify a specific opportunity rather than a blanket GPU advantage: with 32 independent 1</w:t>
+      </w:r>
+      <w:r>
+        <w:t xml:space="preserve"> </w:t>
+      </w:r>
+      <w:r>
+        <w:t xml:space="preserve">MiB pages, Tesla T4 AES-128-CTR resident execution is approximately </w:t>
+      </w:r>
+      <m:oMath>
+        <m:box>
+          <m:e>
+            <m:r>
+              <m:rPr>
+                <m:sty m:val="p"/>
+              </m:rPr>
+              <w:rPr>
+                <w:sz w:val="22"/>
+              </w:rPr>
+              <m:t>2.251</m:t>
+            </m:r>
+            <m:r>
+              <m:rPr>
+                <m:sty m:val="p"/>
+              </m:rPr>
+              <w:rPr>
+                <w:sz w:val="22"/>
+              </w:rPr>
+              <m:t>×</m:t>
+            </m:r>
+          </m:e>
+        </m:box>
+      </m:oMath>
+      <w:r>
+        <w:t xml:space="preserve"> faster than native OpenSSL EVP transformation at the measured compute boundaries. Once the prepared GPU path includes synchronous host</w:t>
+      </w:r>
+      <w:r>
+        <w:t>–</w:t>
+      </w:r>
+      <w:r>
+        <w:t xml:space="preserve">device transfers and synchronization, that ratio falls to </w:t>
+      </w:r>
+      <m:oMath>
+        <m:box>
+          <m:e>
+            <m:r>
+              <m:rPr>
+                <m:sty m:val="p"/>
+              </m:rPr>
+              <w:rPr>
+                <w:sz w:val="22"/>
+              </w:rPr>
+              <m:t>0.913</m:t>
+            </m:r>
+            <m:r>
+              <m:rPr>
+                <m:sty m:val="p"/>
+              </m:rPr>
+              <w:rPr>
+                <w:sz w:val="22"/>
+              </w:rPr>
+              <m:t>×</m:t>
+            </m:r>
+          </m:e>
+        </m:box>
+      </m:oMath>
+      <w:r>
+        <w:t xml:space="preserve"> and the CPU wins in all five sessions. A page-aware kernel with independent counter domains has approximately the same GPU pipeline throughput as a continuous stream of equal size, but this does not establish an acceleration benefit over separate per-page launches.</w:t>
+      </w:r>
+    </w:p>
+    <w:p>
+      <w:pPr>
+        <w:pStyle w:val="JText"/>
+        <w:spacing w:line="240" w:lineRule="auto"/>
+      </w:pPr>
+      <w:r>
+        <w:t xml:space="preserve">A second key finding is baseline sensitivity: the new T4 study reports a </w:t>
+      </w:r>
+      <m:oMath>
+        <m:box>
+          <m:e>
+            <m:r>
+              <m:rPr>
+                <m:sty m:val="p"/>
+              </m:rPr>
+              <w:rPr>
+                <w:sz w:val="22"/>
+              </w:rPr>
+              <m:t>5.586</m:t>
+            </m:r>
+            <m:r>
+              <m:rPr>
+                <m:sty m:val="p"/>
+              </m:rPr>
+              <w:rPr>
+                <w:sz w:val="22"/>
+              </w:rPr>
+              <m:t>×</m:t>
+            </m:r>
+          </m:e>
+        </m:box>
+      </m:oMath>
+      <w:r>
+        <w:t xml:space="preserve"> prepared-pipeline ratio relative to PyCryptodome but </w:t>
+      </w:r>
+      <m:oMath>
+        <m:box>
+          <m:e>
+            <m:r>
+              <m:rPr>
+                <m:sty m:val="p"/>
+              </m:rPr>
+              <w:rPr>
+                <w:sz w:val="22"/>
+              </w:rPr>
+              <m:t>0.942</m:t>
+            </m:r>
+            <m:r>
+              <m:rPr>
+                <m:sty m:val="p"/>
+              </m:rPr>
+              <w:rPr>
+                <w:sz w:val="22"/>
+              </w:rPr>
+              <m:t>×</m:t>
+            </m:r>
+          </m:e>
+        </m:box>
+      </m:oMath>
+      <w:r>
+        <w:t xml:space="preserve"> relative to native OpenSSL. Consequently, library choice and measurement boundaries are essential to any defensible GPU acceleration claim. Earlier three-platform measurements remain historical evidence tied to their original host implementation, not proof of an optimized-CPU advantage.</w:t>
+      </w:r>
+    </w:p>
+    <w:p>
+      <w:pPr>
+        <w:pStyle w:val="JText"/>
+        <w:spacing w:line="240" w:lineRule="auto"/>
+      </w:pPr>
+      <w:r>
+        <w:t>The practical candidate is an application that already keeps its input and subsequent ciphertext consumer on the GPU; in such a pipeline encryption can potentially exploit device-resident computation without paying a full payload round trip. This is an engineering hypothesis supported by the isolated resident result, not an established application speedup. Future work should measure a complete GPU-native producer</w:t>
+      </w:r>
+      <w:r>
+        <w:t>–</w:t>
+      </w:r>
+      <w:r>
+        <w:t>encrypt</w:t>
+      </w:r>
+      <w:r>
+        <w:t>–</w:t>
+      </w:r>
+      <w:r>
+        <w:t>consumer pipeline against an equivalent CPU workload and separately test one-page-per-launch overhead, Parquet-compliant authenticated storage processing, and overlapping data movement. The principal finding is therefore a reproducible boundary between GPU computational gain and transfer-limited execution, together with a validated independent-page workload for investigating that boundary.</w:t>
       </w:r>
     </w:p>
     <w:p>
@@ -6653,7 +8463,7 @@
         <w:jc w:val="left"/>
       </w:pPr>
       <w:r>
-        <w:t>Georg Schönberger, Jürgen Fuß: GPU-Assisted AES Encryption Using GCM, Communications and Multimedia Security, Lecture Notes in Computer Science, Springer, Vol. 7025, 2011, pp. 178–185, doi: 10.1007/978-3-642-24712-5_16.</w:t>
+        <w:t>G. Schönberger, J. Fuß: GPU-Assisted AES Encryption Using GCM, Communications and Multimedia Security, Lecture Notes in Computer Science, Springer, Vol. 7025, 2011, pp. 178–185, doi: 10.1007/978-3-642-24712-5_16.</w:t>
       </w:r>
     </w:p>
     <w:p>
@@ -6662,7 +8472,7 @@
         <w:jc w:val="left"/>
       </w:pPr>
       <w:r>
-        <w:t>JaeSeok Lee, DongCheon Kim, Seog Chung Seo: Parallel Implementation of GCM on GPUs, ICT Express, Vol. 11, No. 2, 2025, pp. 310–316, doi: 10.1016/j.icte.2025.01.006.</w:t>
+        <w:t>J. Lee, D. Kim, S. C. Seo: Parallel Implementation of GCM on GPUs, ICT Express, Vol. 11, No. 2, 2025, pp. 310–316, doi: 10.1016/j.icte.2025.01.006.</w:t>
       </w:r>
     </w:p>
     <w:p>
@@ -6725,16 +8535,7 @@
         <w:jc w:val="left"/>
       </w:pPr>
       <w:r>
-        <w:t>Russ Housley: Using Advanced Encryption Standard (AES) Counter Mode With IPsec Encapsulating Security Payload (ESP), Internet Engineering Task Force, RFC 3686, January 2004, doi: 10.17487/RFC3686.</w:t>
-      </w:r>
-    </w:p>
-    <w:p>
-      <w:pPr>
-        <w:pStyle w:val="JReference"/>
-        <w:jc w:val="left"/>
-      </w:pPr>
-      <w:r>
-        <w:t>John Viega, David A. McGrew: The Use of Galois/Counter Mode (GCM) in IPsec Encapsulating Security Payload (ESP), Internet Engineering Task Force, RFC 4106, June 2005, doi: 10.17487/RFC4106.</w:t>
+        <w:t>Apache Parquet Project: Parquet Modular Encryption, Apache Parquet file format documentation, https://parquet.apache.org/docs/file-format/data-pages/encryption/, Accessed: 2026-10-27.</w:t>
       </w:r>
     </w:p>
     <w:sectPr>

</xml_diff>

<commit_message>
Refactor results section and enhance ARM64 CPU control analysis
- Updated LaTeX table format to use tabularx for better layout in results.
- Added a new subsection detailing an independent ARM64 CPU-only study on Oracle Cloud, comparing AES-128-CTR performance across different implementations.
- Revised section headers for clarity and consistency, including renumbering subsections.
- Enhanced discussion on CPU baseline sensitivity and its implications for GPU performance claims.
- Improved overall structure and readability of the results and discussion sections in the document.
</commit_message>
<xml_diff>
--- a/sjee/main_sjee.docx
+++ b/sjee/main_sjee.docx
@@ -1148,6 +1148,75 @@
         </w:tc>
       </w:tr>
     </w:tbl>
+    <w:p>
+      <w:pPr>
+        <w:pStyle w:val="JSubSubTitle"/>
+      </w:pPr>
+      <w:r>
+        <w:t>3.1</w:t>
+        <w:tab/>
+      </w:r>
+      <w:r>
+        <w:t>Independent ARM64 CPU control</w:t>
+      </w:r>
+    </w:p>
+    <w:p>
+      <w:pPr>
+        <w:pStyle w:val="JText"/>
+        <w:spacing w:line="240" w:lineRule="auto"/>
+      </w:pPr>
+      <w:r>
+        <w:t>An additional CPU-only study was conducted on an Oracle Cloud ARM64 instance with two available vCPUs (Arm Neoverse-N1) and no GPU. It is reported as an architecture and implementation control, not as a fourth CPU</w:t>
+      </w:r>
+      <w:r>
+        <w:t>–</w:t>
+      </w:r>
+      <w:r>
+        <w:t xml:space="preserve">GPU pair. Five single-worker sessions measured AES-128-CTR using PyCryptodome, native OpenSSL 3 EVP with the default CPU capabilities, and an OpenSSL run with </w:t>
+      </w:r>
+      <w:r>
+        <w:rPr>
+          <w:rFonts w:ascii="Courier New" w:hAnsi="Courier New"/>
+        </w:rPr>
+        <w:t>OPENSSL</w:t>
+      </w:r>
+      <w:r>
+        <w:rPr>
+          <w:rFonts w:ascii="Courier New" w:hAnsi="Courier New"/>
+        </w:rPr>
+        <w:t>_</w:t>
+      </w:r>
+      <w:r>
+        <w:rPr>
+          <w:rFonts w:ascii="Courier New" w:hAnsi="Courier New"/>
+        </w:rPr>
+        <w:t>armcap=0</w:t>
+      </w:r>
+      <w:r>
+        <w:t xml:space="preserve">. A separate five-session, two-worker experiment recorded aggregate operation-envelope throughput. All comparisons in this subsection are limited to the Oracle host and their explicitly named measurement intervals. In particular, </w:t>
+      </w:r>
+      <w:r>
+        <w:rPr>
+          <w:rFonts w:ascii="Courier New" w:hAnsi="Courier New"/>
+        </w:rPr>
+        <w:t>OPENSSL</w:t>
+      </w:r>
+      <w:r>
+        <w:rPr>
+          <w:rFonts w:ascii="Courier New" w:hAnsi="Courier New"/>
+        </w:rPr>
+        <w:t>_</w:t>
+      </w:r>
+      <w:r>
+        <w:rPr>
+          <w:rFonts w:ascii="Courier New" w:hAnsi="Courier New"/>
+        </w:rPr>
+        <w:t>armcap=0</w:t>
+      </w:r>
+      <w:r>
+        <w:t xml:space="preserve"> disables multiple Arm acceleration capabilities, so its performance difference is not an isolated measurement of a single AES instruction. Native EVP transform-only timing excludes allocation, Python interoperation, and output conversion; operation-envelope timing includes additional host-side costs. The two-worker results are aggregate throughput, not a twofold reduction in a single request's latency.</w:t>
+      </w:r>
+    </w:p>
     <w:p>
       <w:pPr>
         <w:pStyle w:val="JText"/>
@@ -3335,7 +3404,7 @@
         <w:pStyle w:val="JSubSubTitle"/>
       </w:pPr>
       <w:r>
-        <w:t>3.1</w:t>
+        <w:t>3.2</w:t>
         <w:tab/>
       </w:r>
       <w:r>
@@ -3410,7 +3479,7 @@
         <w:pStyle w:val="JSubSubTitle"/>
       </w:pPr>
       <w:r>
-        <w:t>3.2</w:t>
+        <w:t>3.3</w:t>
         <w:tab/>
       </w:r>
       <w:r>
@@ -6556,6 +6625,105 @@
         <w:tab/>
       </w:r>
       <w:r>
+        <w:t>Oracle cloud ARM64: CPU implementation and envelope controls</w:t>
+      </w:r>
+    </w:p>
+    <w:p>
+      <w:pPr>
+        <w:pStyle w:val="JText"/>
+        <w:spacing w:line="240" w:lineRule="auto"/>
+      </w:pPr>
+      <w:r>
+        <w:t>On the independent Oracle Cloud ARM64 host, the five-session 32</w:t>
+      </w:r>
+      <w:r>
+        <w:t xml:space="preserve"> </w:t>
+      </w:r>
+      <w:r>
+        <w:t>MiB AES-128-CTR study produced approximately 4.03</w:t>
+      </w:r>
+      <w:r>
+        <w:t xml:space="preserve"> </w:t>
+      </w:r>
+      <w:r>
+        <w:t>GB/s of native OpenSSL-default transform-only throughput, compared with approximately 209</w:t>
+      </w:r>
+      <w:r>
+        <w:t xml:space="preserve"> </w:t>
+      </w:r>
+      <w:r>
+        <w:t>MB/s for the PyCryptodome path and 218</w:t>
+      </w:r>
+      <w:r>
+        <w:t xml:space="preserve"> </w:t>
+      </w:r>
+      <w:r>
+        <w:t xml:space="preserve">MB/s for the </w:t>
+      </w:r>
+      <w:r>
+        <w:rPr>
+          <w:rFonts w:ascii="Courier New" w:hAnsi="Courier New"/>
+        </w:rPr>
+        <w:t>OPENSSL</w:t>
+      </w:r>
+      <w:r>
+        <w:rPr>
+          <w:rFonts w:ascii="Courier New" w:hAnsi="Courier New"/>
+        </w:rPr>
+        <w:t>_</w:t>
+      </w:r>
+      <w:r>
+        <w:rPr>
+          <w:rFonts w:ascii="Courier New" w:hAnsi="Courier New"/>
+        </w:rPr>
+        <w:t>armcap=0</w:t>
+      </w:r>
+      <w:r>
+        <w:t xml:space="preserve"> control. These values describe the specific library implementations and timed boundaries; they are not GPU speedups. The default OpenSSL path was approximately 19.3 times faster than the recorded PyCryptodome transform path at this size, with the important qualification that Python/FFI and C-native interval definitions differ.</w:t>
+      </w:r>
+    </w:p>
+    <w:p>
+      <w:pPr>
+        <w:pStyle w:val="JText"/>
+        <w:spacing w:line="240" w:lineRule="auto"/>
+      </w:pPr>
+      <w:r>
+        <w:t>In a separate host-side envelope experiment, a single worker achieved approximately 1.06</w:t>
+      </w:r>
+      <w:r>
+        <w:t xml:space="preserve"> </w:t>
+      </w:r>
+      <w:r>
+        <w:t>GB/s at 32</w:t>
+      </w:r>
+      <w:r>
+        <w:t xml:space="preserve"> </w:t>
+      </w:r>
+      <w:r>
+        <w:t>MiB, while two concurrent workers reached approximately 2.03</w:t>
+      </w:r>
+      <w:r>
+        <w:t xml:space="preserve"> </w:t>
+      </w:r>
+      <w:r>
+        <w:t>GB/s in aggregate, or about 1.92 times the single-worker aggregate rate. These campaigns are not paired per-repetition observations and their envelope boundary differs from the 4.03</w:t>
+      </w:r>
+      <w:r>
+        <w:t xml:space="preserve"> </w:t>
+      </w:r>
+      <w:r>
+        <w:t>GB/s native transform interval. The contrast demonstrates that buffer lifecycle and concurrency must be considered before extending cryptographic core throughput to a complete service. No Oracle result is used to calculate a speedup against the Tesla T4 or other GPU system.</w:t>
+      </w:r>
+    </w:p>
+    <w:p>
+      <w:pPr>
+        <w:pStyle w:val="JSubSubTitle"/>
+      </w:pPr>
+      <w:r>
+        <w:t>4.2</w:t>
+        <w:tab/>
+      </w:r>
+      <w:r>
         <w:t>Revisiting the host baseline on the tesla t4</w:t>
       </w:r>
     </w:p>
@@ -6708,7 +6876,7 @@
         <w:pStyle w:val="JSubSubTitle"/>
       </w:pPr>
       <w:r>
-        <w:t>4.2</w:t>
+        <w:t>4.3</w:t>
         <w:tab/>
       </w:r>
       <w:r>
@@ -8099,6 +8267,27 @@
         <w:tab/>
       </w:r>
       <w:r>
+        <w:t>Cross-architecture evidence from oracle ARM64</w:t>
+      </w:r>
+    </w:p>
+    <w:p>
+      <w:pPr>
+        <w:pStyle w:val="JText"/>
+        <w:spacing w:line="240" w:lineRule="auto"/>
+      </w:pPr>
+      <w:r>
+        <w:t>The Oracle CPU-only control strengthens the baseline-sensitivity argument: on the same ARM64 machine, native OpenSSL-default AES-128-CTR and the recorded PyCryptodome or capability-masked paths differ markedly. This does not show that ARM is intrinsically faster than x86, nor that all of the observed gap is due to AES instructions: implementations, Python interfaces, capability masking, and measurement scopes also matter. The two-worker envelope result additionally illustrates that aggregate throughput and single-request latency answer different questions. Thus, the portable finding is a methodological and architectural constraint: report an optimized, capability-aware host reference and the actual operation boundary before attributing an advantage to accelerator hardware. A future controlled ARM study should trace executed cryptographic instructions, harmonize native call boundaries, and examine additional core counts and AES-256.</w:t>
+      </w:r>
+    </w:p>
+    <w:p>
+      <w:pPr>
+        <w:pStyle w:val="JSubSubTitle"/>
+      </w:pPr>
+      <w:r>
+        <w:t>5.6</w:t>
+        <w:tab/>
+      </w:r>
+      <w:r>
         <w:t>Generalizability, constraints and future work</w:t>
       </w:r>
     </w:p>
@@ -8298,6 +8487,45 @@
       </m:oMath>
       <w:r>
         <w:t xml:space="preserve"> relative to native OpenSSL. Consequently, library choice and measurement boundaries are essential to any defensible GPU acceleration claim. Earlier three-platform measurements remain historical evidence tied to their original host implementation, not proof of an optimized-CPU advantage.</w:t>
+      </w:r>
+    </w:p>
+    <w:p>
+      <w:pPr>
+        <w:pStyle w:val="JText"/>
+        <w:spacing w:line="240" w:lineRule="auto"/>
+      </w:pPr>
+      <w:r>
+        <w:t>An independent Oracle Cloud ARM64 CPU-only control further establishes implementation sensitivity outside x86: at 32</w:t>
+      </w:r>
+      <w:r>
+        <w:t xml:space="preserve"> </w:t>
+      </w:r>
+      <w:r>
+        <w:t>MiB AES-128-CTR, native OpenSSL-default transform throughput was approximately 4.03</w:t>
+      </w:r>
+      <w:r>
+        <w:t xml:space="preserve"> </w:t>
+      </w:r>
+      <w:r>
+        <w:t>GB/s, versus 209</w:t>
+      </w:r>
+      <w:r>
+        <w:t xml:space="preserve"> </w:t>
+      </w:r>
+      <w:r>
+        <w:t>MB/s for the recorded PyCryptodome path, while aggregate operation-envelope throughput increased from approximately 1.06</w:t>
+      </w:r>
+      <w:r>
+        <w:t xml:space="preserve"> </w:t>
+      </w:r>
+      <w:r>
+        <w:t>GB/s with one worker to 2.03</w:t>
+      </w:r>
+      <w:r>
+        <w:t xml:space="preserve"> </w:t>
+      </w:r>
+      <w:r>
+        <w:t>GB/s with two. These differently bounded observations are not compared directly with GPU measurements.</w:t>
       </w:r>
     </w:p>
     <w:p>

</xml_diff>